<commit_message>
docs(CW/1-4): add ЗАВДАННЯ, АНОТАЦІЯ, fix diagram layout and title page
- Add formal ЗАВДАННЯ page with calendar plan
- Add АНОТАЦІЯ (Ukrainian + English)
- Add grade/commission fields to title page
- Add page numbers to ЗМІСТ
- Redesign component diagram: TB→compact layout (1384x1127 ratio)
- Fix all diagram image sizes to preserve aspect ratios
</commit_message>
<xml_diff>
--- a/docs/CW_1-4_TB-43_Stepanenko.docx
+++ b/docs/CW_1-4_TB-43_Stepanenko.docx
@@ -21,23 +21,6 @@
     </w:p>
     <w:p>
       <w:pPr>
-        <w:spacing w:line="360"/>
-      </w:pPr>
-      <w:r>
-        <w:rPr>
-          <w:rFonts w:ascii="Times New Roman" w:cs="Times New Roman" w:eastAsia="Times New Roman" w:hAnsi="Times New Roman"/>
-          <w:b w:val="false"/>
-          <w:bCs w:val="false"/>
-          <w:i w:val="false"/>
-          <w:iCs w:val="false"/>
-          <w:sz w:val="28"/>
-          <w:szCs w:val="28"/>
-        </w:rPr>
-        <w:t xml:space="preserve"/>
-      </w:r>
-    </w:p>
-    <w:p>
-      <w:pPr>
         <w:spacing w:after="60" w:line="360"/>
         <w:jc w:val="center"/>
       </w:pPr>
@@ -249,23 +232,6 @@
     </w:p>
     <w:p>
       <w:pPr>
-        <w:spacing w:line="360"/>
-      </w:pPr>
-      <w:r>
-        <w:rPr>
-          <w:rFonts w:ascii="Times New Roman" w:cs="Times New Roman" w:eastAsia="Times New Roman" w:hAnsi="Times New Roman"/>
-          <w:b w:val="false"/>
-          <w:bCs w:val="false"/>
-          <w:i w:val="false"/>
-          <w:iCs w:val="false"/>
-          <w:sz w:val="28"/>
-          <w:szCs w:val="28"/>
-        </w:rPr>
-        <w:t xml:space="preserve"/>
-      </w:r>
-    </w:p>
-    <w:p>
-      <w:pPr>
         <w:spacing w:after="40" w:line="360"/>
         <w:jc w:val="right"/>
       </w:pPr>
@@ -350,19 +316,24 @@
           <w:sz w:val="28"/>
           <w:szCs w:val="28"/>
         </w:rPr>
-        <w:t xml:space="preserve">GitHub: </w:t>
-      </w:r>
-      <w:r>
-        <w:rPr>
-          <w:rFonts w:ascii="Times New Roman" w:cs="Times New Roman" w:eastAsia="Times New Roman" w:hAnsi="Times New Roman"/>
-          <w:b w:val="false"/>
-          <w:bCs w:val="false"/>
-          <w:i w:val="false"/>
-          <w:iCs w:val="false"/>
-          <w:sz w:val="28"/>
-          <w:szCs w:val="28"/>
-        </w:rPr>
-        <w:t xml:space="preserve">https://github.com/d3Par1/Coursework_Web</w:t>
+        <w:t xml:space="preserve">GitHub репозиторій: https://github.com/d3Par1/Coursework_Web</w:t>
+      </w:r>
+    </w:p>
+    <w:p>
+      <w:pPr>
+        <w:spacing w:line="360"/>
+      </w:pPr>
+      <w:r>
+        <w:rPr>
+          <w:rFonts w:ascii="Times New Roman" w:cs="Times New Roman" w:eastAsia="Times New Roman" w:hAnsi="Times New Roman"/>
+          <w:b w:val="false"/>
+          <w:bCs w:val="false"/>
+          <w:i w:val="false"/>
+          <w:iCs w:val="false"/>
+          <w:sz w:val="28"/>
+          <w:szCs w:val="28"/>
+        </w:rPr>
+        <w:t xml:space="preserve"/>
       </w:r>
     </w:p>
     <w:p>
@@ -419,6 +390,42 @@
     </w:p>
     <w:p>
       <w:pPr>
+        <w:spacing w:after="40" w:line="360"/>
+        <w:jc w:val="left"/>
+      </w:pPr>
+      <w:r>
+        <w:rPr>
+          <w:rFonts w:ascii="Times New Roman" w:cs="Times New Roman" w:eastAsia="Times New Roman" w:hAnsi="Times New Roman"/>
+          <w:b w:val="false"/>
+          <w:bCs w:val="false"/>
+          <w:i w:val="false"/>
+          <w:iCs w:val="false"/>
+          <w:sz w:val="28"/>
+          <w:szCs w:val="28"/>
+        </w:rPr>
+        <w:t xml:space="preserve">Національна оцінка ________________</w:t>
+      </w:r>
+    </w:p>
+    <w:p>
+      <w:pPr>
+        <w:spacing w:after="40" w:line="360"/>
+        <w:jc w:val="left"/>
+      </w:pPr>
+      <w:r>
+        <w:rPr>
+          <w:rFonts w:ascii="Times New Roman" w:cs="Times New Roman" w:eastAsia="Times New Roman" w:hAnsi="Times New Roman"/>
+          <w:b w:val="false"/>
+          <w:bCs w:val="false"/>
+          <w:i w:val="false"/>
+          <w:iCs w:val="false"/>
+          <w:sz w:val="28"/>
+          <w:szCs w:val="28"/>
+        </w:rPr>
+        <w:t xml:space="preserve">Кількість балів: __________  Оцінка: ECTS _____</w:t>
+      </w:r>
+    </w:p>
+    <w:p>
+      <w:pPr>
         <w:spacing w:line="360"/>
       </w:pPr>
       <w:r>
@@ -436,19 +443,56 @@
     </w:p>
     <w:p>
       <w:pPr>
-        <w:spacing w:line="360"/>
-      </w:pPr>
-      <w:r>
-        <w:rPr>
-          <w:rFonts w:ascii="Times New Roman" w:cs="Times New Roman" w:eastAsia="Times New Roman" w:hAnsi="Times New Roman"/>
-          <w:b w:val="false"/>
-          <w:bCs w:val="false"/>
-          <w:i w:val="false"/>
-          <w:iCs w:val="false"/>
-          <w:sz w:val="28"/>
-          <w:szCs w:val="28"/>
-        </w:rPr>
-        <w:t xml:space="preserve"/>
+        <w:spacing w:after="40" w:line="360"/>
+        <w:jc w:val="left"/>
+      </w:pPr>
+      <w:r>
+        <w:rPr>
+          <w:rFonts w:ascii="Times New Roman" w:cs="Times New Roman" w:eastAsia="Times New Roman" w:hAnsi="Times New Roman"/>
+          <w:b w:val="false"/>
+          <w:bCs w:val="false"/>
+          <w:i w:val="false"/>
+          <w:iCs w:val="false"/>
+          <w:sz w:val="28"/>
+          <w:szCs w:val="28"/>
+        </w:rPr>
+        <w:t xml:space="preserve">Член комісії</w:t>
+      </w:r>
+    </w:p>
+    <w:p>
+      <w:pPr>
+        <w:spacing w:after="40" w:line="360"/>
+        <w:jc w:val="left"/>
+      </w:pPr>
+      <w:r>
+        <w:rPr>
+          <w:rFonts w:ascii="Times New Roman" w:cs="Times New Roman" w:eastAsia="Times New Roman" w:hAnsi="Times New Roman"/>
+          <w:b w:val="false"/>
+          <w:bCs w:val="false"/>
+          <w:i w:val="false"/>
+          <w:iCs w:val="false"/>
+          <w:sz w:val="28"/>
+          <w:szCs w:val="28"/>
+        </w:rPr>
+        <w:t xml:space="preserve">________________  ____________________________</w:t>
+      </w:r>
+    </w:p>
+    <w:p>
+      <w:pPr>
+        <w:spacing w:after="40" w:line="360"/>
+        <w:jc w:val="left"/>
+      </w:pPr>
+      <w:r>
+        <w:rPr>
+          <w:rFonts w:ascii="Times New Roman" w:cs="Times New Roman" w:eastAsia="Times New Roman" w:hAnsi="Times New Roman"/>
+          <w:b w:val="false"/>
+          <w:bCs w:val="false"/>
+          <w:i w:val="false"/>
+          <w:iCs w:val="false"/>
+          <w:sz w:val="28"/>
+          <w:szCs w:val="28"/>
+        </w:rPr>
+        <w:t xml:space="preserve">________________  ____________________________</w:t>
       </w:r>
     </w:p>
     <w:p>
@@ -501,6 +545,1244 @@
           <w:szCs w:val="28"/>
         </w:rPr>
         <w:t xml:space="preserve">Київ – 2025/2026</w:t>
+      </w:r>
+    </w:p>
+    <w:p>
+      <w:r>
+        <w:br w:type="page"/>
+      </w:r>
+    </w:p>
+    <w:p>
+      <w:pPr>
+        <w:spacing w:after="60" w:line="360"/>
+        <w:jc w:val="center"/>
+      </w:pPr>
+      <w:r>
+        <w:rPr>
+          <w:rFonts w:ascii="Times New Roman" w:cs="Times New Roman" w:eastAsia="Times New Roman" w:hAnsi="Times New Roman"/>
+          <w:b/>
+          <w:bCs/>
+          <w:i w:val="false"/>
+          <w:iCs w:val="false"/>
+          <w:sz w:val="24"/>
+          <w:szCs w:val="24"/>
+        </w:rPr>
+        <w:t xml:space="preserve">НАЦІОНАЛЬНИЙ ТЕХНІЧНИЙ УНІВЕРСИТЕТ УКРАЇНИ</w:t>
+      </w:r>
+    </w:p>
+    <w:p>
+      <w:pPr>
+        <w:spacing w:after="60" w:line="360"/>
+        <w:jc w:val="center"/>
+      </w:pPr>
+      <w:r>
+        <w:rPr>
+          <w:rFonts w:ascii="Times New Roman" w:cs="Times New Roman" w:eastAsia="Times New Roman" w:hAnsi="Times New Roman"/>
+          <w:b/>
+          <w:bCs/>
+          <w:i w:val="false"/>
+          <w:iCs w:val="false"/>
+          <w:sz w:val="24"/>
+          <w:szCs w:val="24"/>
+        </w:rPr>
+        <w:t xml:space="preserve">«КИЇВСЬКИЙ ПОЛІТЕХНІЧНИЙ ІНСТИТУТ імені ІГОРЯ СІКОРСЬКОГО»</w:t>
+      </w:r>
+    </w:p>
+    <w:p>
+      <w:pPr>
+        <w:spacing w:line="360"/>
+      </w:pPr>
+      <w:r>
+        <w:rPr>
+          <w:rFonts w:ascii="Times New Roman" w:cs="Times New Roman" w:eastAsia="Times New Roman" w:hAnsi="Times New Roman"/>
+          <w:b w:val="false"/>
+          <w:bCs w:val="false"/>
+          <w:i w:val="false"/>
+          <w:iCs w:val="false"/>
+          <w:sz w:val="28"/>
+          <w:szCs w:val="28"/>
+        </w:rPr>
+        <w:t xml:space="preserve"/>
+      </w:r>
+    </w:p>
+    <w:p>
+      <w:pPr>
+        <w:spacing w:after="40" w:line="360"/>
+        <w:jc w:val="both"/>
+      </w:pPr>
+      <w:r>
+        <w:rPr>
+          <w:rFonts w:ascii="Times New Roman" w:cs="Times New Roman" w:eastAsia="Times New Roman" w:hAnsi="Times New Roman"/>
+          <w:b w:val="false"/>
+          <w:bCs w:val="false"/>
+          <w:i w:val="false"/>
+          <w:iCs w:val="false"/>
+          <w:sz w:val="24"/>
+          <w:szCs w:val="24"/>
+        </w:rPr>
+        <w:t xml:space="preserve">Навчально-науковий інститут атомної та теплової енергетики</w:t>
+      </w:r>
+    </w:p>
+    <w:p>
+      <w:pPr>
+        <w:spacing w:after="40" w:line="360"/>
+        <w:jc w:val="both"/>
+      </w:pPr>
+      <w:r>
+        <w:rPr>
+          <w:rFonts w:ascii="Times New Roman" w:cs="Times New Roman" w:eastAsia="Times New Roman" w:hAnsi="Times New Roman"/>
+          <w:b w:val="false"/>
+          <w:bCs w:val="false"/>
+          <w:i w:val="false"/>
+          <w:iCs w:val="false"/>
+          <w:sz w:val="24"/>
+          <w:szCs w:val="24"/>
+        </w:rPr>
+        <w:t xml:space="preserve">Кафедра інженерії програмного забезпечення в енергетиці</w:t>
+      </w:r>
+    </w:p>
+    <w:p>
+      <w:pPr>
+        <w:spacing w:after="40" w:line="360"/>
+        <w:jc w:val="both"/>
+      </w:pPr>
+      <w:r>
+        <w:rPr>
+          <w:rFonts w:ascii="Times New Roman" w:cs="Times New Roman" w:eastAsia="Times New Roman" w:hAnsi="Times New Roman"/>
+          <w:b w:val="false"/>
+          <w:bCs w:val="false"/>
+          <w:i w:val="false"/>
+          <w:iCs w:val="false"/>
+          <w:sz w:val="24"/>
+          <w:szCs w:val="24"/>
+        </w:rPr>
+        <w:t xml:space="preserve">Напрям підготовки 121 Інженерія програмного забезпечення</w:t>
+      </w:r>
+    </w:p>
+    <w:p>
+      <w:pPr>
+        <w:spacing w:line="360"/>
+      </w:pPr>
+      <w:r>
+        <w:rPr>
+          <w:rFonts w:ascii="Times New Roman" w:cs="Times New Roman" w:eastAsia="Times New Roman" w:hAnsi="Times New Roman"/>
+          <w:b w:val="false"/>
+          <w:bCs w:val="false"/>
+          <w:i w:val="false"/>
+          <w:iCs w:val="false"/>
+          <w:sz w:val="28"/>
+          <w:szCs w:val="28"/>
+        </w:rPr>
+        <w:t xml:space="preserve"/>
+      </w:r>
+    </w:p>
+    <w:p>
+      <w:pPr>
+        <w:spacing w:after="60" w:line="360"/>
+        <w:jc w:val="center"/>
+      </w:pPr>
+      <w:r>
+        <w:rPr>
+          <w:rFonts w:ascii="Times New Roman" w:cs="Times New Roman" w:eastAsia="Times New Roman" w:hAnsi="Times New Roman"/>
+          <w:b/>
+          <w:bCs/>
+          <w:i w:val="false"/>
+          <w:iCs w:val="false"/>
+          <w:sz w:val="32"/>
+          <w:szCs w:val="32"/>
+        </w:rPr>
+        <w:t xml:space="preserve">З А В Д А Н Н Я</w:t>
+      </w:r>
+    </w:p>
+    <w:p>
+      <w:pPr>
+        <w:spacing w:after="60" w:line="360"/>
+        <w:jc w:val="center"/>
+      </w:pPr>
+      <w:r>
+        <w:rPr>
+          <w:rFonts w:ascii="Times New Roman" w:cs="Times New Roman" w:eastAsia="Times New Roman" w:hAnsi="Times New Roman"/>
+          <w:b/>
+          <w:bCs/>
+          <w:i w:val="false"/>
+          <w:iCs w:val="false"/>
+          <w:sz w:val="28"/>
+          <w:szCs w:val="28"/>
+        </w:rPr>
+        <w:t xml:space="preserve">НА КУРСОВУ РОБОТУ СТУДЕНТУ</w:t>
+      </w:r>
+    </w:p>
+    <w:p>
+      <w:pPr>
+        <w:spacing w:after="60" w:line="360"/>
+        <w:jc w:val="center"/>
+      </w:pPr>
+      <w:r>
+        <w:rPr>
+          <w:rFonts w:ascii="Times New Roman" w:cs="Times New Roman" w:eastAsia="Times New Roman" w:hAnsi="Times New Roman"/>
+          <w:b w:val="false"/>
+          <w:bCs w:val="false"/>
+          <w:i w:val="false"/>
+          <w:iCs w:val="false"/>
+          <w:sz w:val="28"/>
+          <w:szCs w:val="28"/>
+        </w:rPr>
+        <w:t xml:space="preserve">Степаненку Назару Юрійовичу</w:t>
+      </w:r>
+    </w:p>
+    <w:p>
+      <w:pPr>
+        <w:spacing w:line="360"/>
+      </w:pPr>
+      <w:r>
+        <w:rPr>
+          <w:rFonts w:ascii="Times New Roman" w:cs="Times New Roman" w:eastAsia="Times New Roman" w:hAnsi="Times New Roman"/>
+          <w:b w:val="false"/>
+          <w:bCs w:val="false"/>
+          <w:i w:val="false"/>
+          <w:iCs w:val="false"/>
+          <w:sz w:val="28"/>
+          <w:szCs w:val="28"/>
+        </w:rPr>
+        <w:t xml:space="preserve"/>
+      </w:r>
+    </w:p>
+    <w:p>
+      <w:pPr>
+        <w:spacing w:after="120" w:line="360"/>
+        <w:ind w:firstLine="708"/>
+        <w:jc w:val="both"/>
+      </w:pPr>
+      <w:r>
+        <w:rPr>
+          <w:rFonts w:ascii="Times New Roman" w:cs="Times New Roman" w:eastAsia="Times New Roman" w:hAnsi="Times New Roman"/>
+          <w:b w:val="false"/>
+          <w:bCs w:val="false"/>
+          <w:i w:val="false"/>
+          <w:iCs w:val="false"/>
+          <w:sz w:val="28"/>
+          <w:szCs w:val="28"/>
+        </w:rPr>
+        <w:t xml:space="preserve">1.  Тема роботи – «Додаток для фінансового менеджменту»</w:t>
+      </w:r>
+    </w:p>
+    <w:p>
+      <w:pPr>
+        <w:spacing w:after="120" w:line="360"/>
+        <w:ind w:firstLine="708"/>
+        <w:jc w:val="both"/>
+      </w:pPr>
+      <w:r>
+        <w:rPr>
+          <w:rFonts w:ascii="Times New Roman" w:cs="Times New Roman" w:eastAsia="Times New Roman" w:hAnsi="Times New Roman"/>
+          <w:b w:val="false"/>
+          <w:bCs w:val="false"/>
+          <w:i w:val="false"/>
+          <w:iCs w:val="false"/>
+          <w:sz w:val="28"/>
+          <w:szCs w:val="28"/>
+        </w:rPr>
+        <w:t xml:space="preserve">Керівник курсової роботи – Недашківський О. Л., д.т.н., доцент</w:t>
+      </w:r>
+    </w:p>
+    <w:p>
+      <w:pPr>
+        <w:spacing w:after="120" w:line="360"/>
+        <w:ind w:firstLine="708"/>
+        <w:jc w:val="both"/>
+      </w:pPr>
+      <w:r>
+        <w:rPr>
+          <w:rFonts w:ascii="Times New Roman" w:cs="Times New Roman" w:eastAsia="Times New Roman" w:hAnsi="Times New Roman"/>
+          <w:b w:val="false"/>
+          <w:bCs w:val="false"/>
+          <w:i w:val="false"/>
+          <w:iCs w:val="false"/>
+          <w:sz w:val="28"/>
+          <w:szCs w:val="28"/>
+        </w:rPr>
+        <w:t xml:space="preserve">2.  Строк подання студентом роботи: «17» травня 2026 р.</w:t>
+      </w:r>
+    </w:p>
+    <w:p>
+      <w:pPr>
+        <w:spacing w:after="120" w:line="360"/>
+        <w:ind w:firstLine="708"/>
+        <w:jc w:val="both"/>
+      </w:pPr>
+      <w:r>
+        <w:rPr>
+          <w:rFonts w:ascii="Times New Roman" w:cs="Times New Roman" w:eastAsia="Times New Roman" w:hAnsi="Times New Roman"/>
+          <w:b w:val="false"/>
+          <w:bCs w:val="false"/>
+          <w:i w:val="false"/>
+          <w:iCs w:val="false"/>
+          <w:sz w:val="28"/>
+          <w:szCs w:val="28"/>
+        </w:rPr>
+        <w:t xml:space="preserve">3.  Вихідні дані до проекту: мова програмування – JavaScript (Node.js), фреймворк – Express 4, база даних – SQLite (better-sqlite3), CSS-фреймворк – Bootstrap 5, візуалізація – Chart.js.</w:t>
+      </w:r>
+    </w:p>
+    <w:p>
+      <w:pPr>
+        <w:spacing w:after="120" w:line="360"/>
+        <w:ind w:firstLine="708"/>
+        <w:jc w:val="both"/>
+      </w:pPr>
+      <w:r>
+        <w:rPr>
+          <w:rFonts w:ascii="Times New Roman" w:cs="Times New Roman" w:eastAsia="Times New Roman" w:hAnsi="Times New Roman"/>
+          <w:b w:val="false"/>
+          <w:bCs w:val="false"/>
+          <w:i w:val="false"/>
+          <w:iCs w:val="false"/>
+          <w:sz w:val="28"/>
+          <w:szCs w:val="28"/>
+        </w:rPr>
+        <w:t xml:space="preserve">4.  Зміст розрахунково-пояснювальної записки: розробити веб-додаток для персонального фінансового менеджменту з функціями обліку доходів та витрат, керування рахунками, категоризації транзакцій, бюджетування та візуалізації фінансового стану.</w:t>
+      </w:r>
+    </w:p>
+    <w:p>
+      <w:pPr>
+        <w:spacing w:after="120" w:line="360"/>
+        <w:ind w:firstLine="708"/>
+        <w:jc w:val="both"/>
+      </w:pPr>
+      <w:r>
+        <w:rPr>
+          <w:rFonts w:ascii="Times New Roman" w:cs="Times New Roman" w:eastAsia="Times New Roman" w:hAnsi="Times New Roman"/>
+          <w:b w:val="false"/>
+          <w:bCs w:val="false"/>
+          <w:i w:val="false"/>
+          <w:iCs w:val="false"/>
+          <w:sz w:val="28"/>
+          <w:szCs w:val="28"/>
+        </w:rPr>
+        <w:t xml:space="preserve">5.  Дата видачі завдання: 15 лютого 2026 р.</w:t>
+      </w:r>
+    </w:p>
+    <w:p>
+      <w:pPr>
+        <w:spacing w:line="360"/>
+      </w:pPr>
+      <w:r>
+        <w:rPr>
+          <w:rFonts w:ascii="Times New Roman" w:cs="Times New Roman" w:eastAsia="Times New Roman" w:hAnsi="Times New Roman"/>
+          <w:b w:val="false"/>
+          <w:bCs w:val="false"/>
+          <w:i w:val="false"/>
+          <w:iCs w:val="false"/>
+          <w:sz w:val="28"/>
+          <w:szCs w:val="28"/>
+        </w:rPr>
+        <w:t xml:space="preserve"/>
+      </w:r>
+    </w:p>
+    <w:p>
+      <w:pPr>
+        <w:spacing w:after="60" w:line="360"/>
+        <w:jc w:val="center"/>
+      </w:pPr>
+      <w:r>
+        <w:rPr>
+          <w:rFonts w:ascii="Times New Roman" w:cs="Times New Roman" w:eastAsia="Times New Roman" w:hAnsi="Times New Roman"/>
+          <w:b/>
+          <w:bCs/>
+          <w:i w:val="false"/>
+          <w:iCs w:val="false"/>
+          <w:sz w:val="28"/>
+          <w:szCs w:val="28"/>
+        </w:rPr>
+        <w:t xml:space="preserve">КАЛЕНДАРНИЙ ПЛАН</w:t>
+      </w:r>
+    </w:p>
+    <w:p>
+      <w:pPr>
+        <w:spacing w:line="360"/>
+      </w:pPr>
+      <w:r>
+        <w:rPr>
+          <w:rFonts w:ascii="Times New Roman" w:cs="Times New Roman" w:eastAsia="Times New Roman" w:hAnsi="Times New Roman"/>
+          <w:b w:val="false"/>
+          <w:bCs w:val="false"/>
+          <w:i w:val="false"/>
+          <w:iCs w:val="false"/>
+          <w:sz w:val="28"/>
+          <w:szCs w:val="28"/>
+        </w:rPr>
+        <w:t xml:space="preserve"/>
+      </w:r>
+    </w:p>
+    <w:tbl>
+      <w:tblPr>
+        <w:tblW w:type="pct" w:w="100%"/>
+        <w:tblBorders>
+          <w:top w:val="single" w:color="000000" w:sz="1"/>
+          <w:left w:val="single" w:color="000000" w:sz="1"/>
+          <w:bottom w:val="single" w:color="000000" w:sz="1"/>
+          <w:right w:val="single" w:color="000000" w:sz="1"/>
+          <w:insideH w:val="single" w:color="000000" w:sz="1"/>
+          <w:insideV w:val="single" w:color="000000" w:sz="1"/>
+        </w:tblBorders>
+      </w:tblPr>
+      <w:tblGrid>
+        <w:gridCol w:w="100"/>
+        <w:gridCol w:w="100"/>
+        <w:gridCol w:w="100"/>
+      </w:tblGrid>
+      <w:tr>
+        <w:trPr>
+          <w:tblHeader/>
+        </w:trPr>
+        <w:tc>
+          <w:tcPr>
+            <w:tcW w:type="pct" w:w="33%"/>
+          </w:tcPr>
+          <w:p>
+            <w:pPr>
+              <w:spacing w:after="40" w:line="360"/>
+              <w:jc w:val="left"/>
+            </w:pPr>
+            <w:r>
+              <w:rPr>
+                <w:rFonts w:ascii="Times New Roman" w:cs="Times New Roman" w:eastAsia="Times New Roman" w:hAnsi="Times New Roman"/>
+                <w:b/>
+                <w:bCs/>
+                <w:i w:val="false"/>
+                <w:iCs w:val="false"/>
+                <w:sz w:val="24"/>
+                <w:szCs w:val="24"/>
+              </w:rPr>
+              <w:t xml:space="preserve">№</w:t>
+            </w:r>
+          </w:p>
+        </w:tc>
+        <w:tc>
+          <w:tcPr>
+            <w:tcW w:type="pct" w:w="33%"/>
+          </w:tcPr>
+          <w:p>
+            <w:pPr>
+              <w:spacing w:after="40" w:line="360"/>
+              <w:jc w:val="left"/>
+            </w:pPr>
+            <w:r>
+              <w:rPr>
+                <w:rFonts w:ascii="Times New Roman" w:cs="Times New Roman" w:eastAsia="Times New Roman" w:hAnsi="Times New Roman"/>
+                <w:b/>
+                <w:bCs/>
+                <w:i w:val="false"/>
+                <w:iCs w:val="false"/>
+                <w:sz w:val="24"/>
+                <w:szCs w:val="24"/>
+              </w:rPr>
+              <w:t xml:space="preserve">Назва етапу</w:t>
+            </w:r>
+          </w:p>
+        </w:tc>
+        <w:tc>
+          <w:tcPr>
+            <w:tcW w:type="pct" w:w="33%"/>
+          </w:tcPr>
+          <w:p>
+            <w:pPr>
+              <w:spacing w:after="40" w:line="360"/>
+              <w:jc w:val="left"/>
+            </w:pPr>
+            <w:r>
+              <w:rPr>
+                <w:rFonts w:ascii="Times New Roman" w:cs="Times New Roman" w:eastAsia="Times New Roman" w:hAnsi="Times New Roman"/>
+                <w:b/>
+                <w:bCs/>
+                <w:i w:val="false"/>
+                <w:iCs w:val="false"/>
+                <w:sz w:val="24"/>
+                <w:szCs w:val="24"/>
+              </w:rPr>
+              <w:t xml:space="preserve">Строк виконання</w:t>
+            </w:r>
+          </w:p>
+        </w:tc>
+      </w:tr>
+      <w:tr>
+        <w:tc>
+          <w:tcPr>
+            <w:tcW w:type="pct" w:w="33%"/>
+          </w:tcPr>
+          <w:p>
+            <w:pPr>
+              <w:spacing w:after="40" w:line="360"/>
+              <w:jc w:val="left"/>
+            </w:pPr>
+            <w:r>
+              <w:rPr>
+                <w:rFonts w:ascii="Times New Roman" w:cs="Times New Roman" w:eastAsia="Times New Roman" w:hAnsi="Times New Roman"/>
+                <w:b w:val="false"/>
+                <w:bCs w:val="false"/>
+                <w:i w:val="false"/>
+                <w:iCs w:val="false"/>
+                <w:sz w:val="24"/>
+                <w:szCs w:val="24"/>
+              </w:rPr>
+              <w:t xml:space="preserve">1</w:t>
+            </w:r>
+          </w:p>
+        </w:tc>
+        <w:tc>
+          <w:tcPr>
+            <w:tcW w:type="pct" w:w="33%"/>
+          </w:tcPr>
+          <w:p>
+            <w:pPr>
+              <w:spacing w:after="40" w:line="360"/>
+              <w:jc w:val="left"/>
+            </w:pPr>
+            <w:r>
+              <w:rPr>
+                <w:rFonts w:ascii="Times New Roman" w:cs="Times New Roman" w:eastAsia="Times New Roman" w:hAnsi="Times New Roman"/>
+                <w:b w:val="false"/>
+                <w:bCs w:val="false"/>
+                <w:i w:val="false"/>
+                <w:iCs w:val="false"/>
+                <w:sz w:val="24"/>
+                <w:szCs w:val="24"/>
+              </w:rPr>
+              <w:t xml:space="preserve">Створення діаграм компонентів, взаємодії та класів</w:t>
+            </w:r>
+          </w:p>
+        </w:tc>
+        <w:tc>
+          <w:tcPr>
+            <w:tcW w:type="pct" w:w="33%"/>
+          </w:tcPr>
+          <w:p>
+            <w:pPr>
+              <w:spacing w:after="40" w:line="360"/>
+              <w:jc w:val="left"/>
+            </w:pPr>
+            <w:r>
+              <w:rPr>
+                <w:rFonts w:ascii="Times New Roman" w:cs="Times New Roman" w:eastAsia="Times New Roman" w:hAnsi="Times New Roman"/>
+                <w:b w:val="false"/>
+                <w:bCs w:val="false"/>
+                <w:i w:val="false"/>
+                <w:iCs w:val="false"/>
+                <w:sz w:val="24"/>
+                <w:szCs w:val="24"/>
+              </w:rPr>
+              <w:t xml:space="preserve">2 тиждень</w:t>
+            </w:r>
+          </w:p>
+        </w:tc>
+      </w:tr>
+      <w:tr>
+        <w:tc>
+          <w:tcPr>
+            <w:tcW w:type="pct" w:w="33%"/>
+          </w:tcPr>
+          <w:p>
+            <w:pPr>
+              <w:spacing w:after="40" w:line="360"/>
+              <w:jc w:val="left"/>
+            </w:pPr>
+            <w:r>
+              <w:rPr>
+                <w:rFonts w:ascii="Times New Roman" w:cs="Times New Roman" w:eastAsia="Times New Roman" w:hAnsi="Times New Roman"/>
+                <w:b w:val="false"/>
+                <w:bCs w:val="false"/>
+                <w:i w:val="false"/>
+                <w:iCs w:val="false"/>
+                <w:sz w:val="24"/>
+                <w:szCs w:val="24"/>
+              </w:rPr>
+              <w:t xml:space="preserve">2</w:t>
+            </w:r>
+          </w:p>
+        </w:tc>
+        <w:tc>
+          <w:tcPr>
+            <w:tcW w:type="pct" w:w="33%"/>
+          </w:tcPr>
+          <w:p>
+            <w:pPr>
+              <w:spacing w:after="40" w:line="360"/>
+              <w:jc w:val="left"/>
+            </w:pPr>
+            <w:r>
+              <w:rPr>
+                <w:rFonts w:ascii="Times New Roman" w:cs="Times New Roman" w:eastAsia="Times New Roman" w:hAnsi="Times New Roman"/>
+                <w:b w:val="false"/>
+                <w:bCs w:val="false"/>
+                <w:i w:val="false"/>
+                <w:iCs w:val="false"/>
+                <w:sz w:val="24"/>
+                <w:szCs w:val="24"/>
+              </w:rPr>
+              <w:t xml:space="preserve">Проектування структури меню</w:t>
+            </w:r>
+          </w:p>
+        </w:tc>
+        <w:tc>
+          <w:tcPr>
+            <w:tcW w:type="pct" w:w="33%"/>
+          </w:tcPr>
+          <w:p>
+            <w:pPr>
+              <w:spacing w:after="40" w:line="360"/>
+              <w:jc w:val="left"/>
+            </w:pPr>
+            <w:r>
+              <w:rPr>
+                <w:rFonts w:ascii="Times New Roman" w:cs="Times New Roman" w:eastAsia="Times New Roman" w:hAnsi="Times New Roman"/>
+                <w:b w:val="false"/>
+                <w:bCs w:val="false"/>
+                <w:i w:val="false"/>
+                <w:iCs w:val="false"/>
+                <w:sz w:val="24"/>
+                <w:szCs w:val="24"/>
+              </w:rPr>
+              <w:t xml:space="preserve">3 тиждень</w:t>
+            </w:r>
+          </w:p>
+        </w:tc>
+      </w:tr>
+      <w:tr>
+        <w:tc>
+          <w:tcPr>
+            <w:tcW w:type="pct" w:w="33%"/>
+          </w:tcPr>
+          <w:p>
+            <w:pPr>
+              <w:spacing w:after="40" w:line="360"/>
+              <w:jc w:val="left"/>
+            </w:pPr>
+            <w:r>
+              <w:rPr>
+                <w:rFonts w:ascii="Times New Roman" w:cs="Times New Roman" w:eastAsia="Times New Roman" w:hAnsi="Times New Roman"/>
+                <w:b w:val="false"/>
+                <w:bCs w:val="false"/>
+                <w:i w:val="false"/>
+                <w:iCs w:val="false"/>
+                <w:sz w:val="24"/>
+                <w:szCs w:val="24"/>
+              </w:rPr>
+              <w:t xml:space="preserve">3</w:t>
+            </w:r>
+          </w:p>
+        </w:tc>
+        <w:tc>
+          <w:tcPr>
+            <w:tcW w:type="pct" w:w="33%"/>
+          </w:tcPr>
+          <w:p>
+            <w:pPr>
+              <w:spacing w:after="40" w:line="360"/>
+              <w:jc w:val="left"/>
+            </w:pPr>
+            <w:r>
+              <w:rPr>
+                <w:rFonts w:ascii="Times New Roman" w:cs="Times New Roman" w:eastAsia="Times New Roman" w:hAnsi="Times New Roman"/>
+                <w:b w:val="false"/>
+                <w:bCs w:val="false"/>
+                <w:i w:val="false"/>
+                <w:iCs w:val="false"/>
+                <w:sz w:val="24"/>
+                <w:szCs w:val="24"/>
+              </w:rPr>
+              <w:t xml:space="preserve">Розміщення та стилізація елементів інтерфейсу</w:t>
+            </w:r>
+          </w:p>
+        </w:tc>
+        <w:tc>
+          <w:tcPr>
+            <w:tcW w:type="pct" w:w="33%"/>
+          </w:tcPr>
+          <w:p>
+            <w:pPr>
+              <w:spacing w:after="40" w:line="360"/>
+              <w:jc w:val="left"/>
+            </w:pPr>
+            <w:r>
+              <w:rPr>
+                <w:rFonts w:ascii="Times New Roman" w:cs="Times New Roman" w:eastAsia="Times New Roman" w:hAnsi="Times New Roman"/>
+                <w:b w:val="false"/>
+                <w:bCs w:val="false"/>
+                <w:i w:val="false"/>
+                <w:iCs w:val="false"/>
+                <w:sz w:val="24"/>
+                <w:szCs w:val="24"/>
+              </w:rPr>
+              <w:t xml:space="preserve">4–5 тижні</w:t>
+            </w:r>
+          </w:p>
+        </w:tc>
+      </w:tr>
+      <w:tr>
+        <w:tc>
+          <w:tcPr>
+            <w:tcW w:type="pct" w:w="33%"/>
+          </w:tcPr>
+          <w:p>
+            <w:pPr>
+              <w:spacing w:after="40" w:line="360"/>
+              <w:jc w:val="left"/>
+            </w:pPr>
+            <w:r>
+              <w:rPr>
+                <w:rFonts w:ascii="Times New Roman" w:cs="Times New Roman" w:eastAsia="Times New Roman" w:hAnsi="Times New Roman"/>
+                <w:b w:val="false"/>
+                <w:bCs w:val="false"/>
+                <w:i w:val="false"/>
+                <w:iCs w:val="false"/>
+                <w:sz w:val="24"/>
+                <w:szCs w:val="24"/>
+              </w:rPr>
+              <w:t xml:space="preserve">4</w:t>
+            </w:r>
+          </w:p>
+        </w:tc>
+        <w:tc>
+          <w:tcPr>
+            <w:tcW w:type="pct" w:w="33%"/>
+          </w:tcPr>
+          <w:p>
+            <w:pPr>
+              <w:spacing w:after="40" w:line="360"/>
+              <w:jc w:val="left"/>
+            </w:pPr>
+            <w:r>
+              <w:rPr>
+                <w:rFonts w:ascii="Times New Roman" w:cs="Times New Roman" w:eastAsia="Times New Roman" w:hAnsi="Times New Roman"/>
+                <w:b w:val="false"/>
+                <w:bCs w:val="false"/>
+                <w:i w:val="false"/>
+                <w:iCs w:val="false"/>
+                <w:sz w:val="24"/>
+                <w:szCs w:val="24"/>
+              </w:rPr>
+              <w:t xml:space="preserve">Проектування та реалізація моделей даних</w:t>
+            </w:r>
+          </w:p>
+        </w:tc>
+        <w:tc>
+          <w:tcPr>
+            <w:tcW w:type="pct" w:w="33%"/>
+          </w:tcPr>
+          <w:p>
+            <w:pPr>
+              <w:spacing w:after="40" w:line="360"/>
+              <w:jc w:val="left"/>
+            </w:pPr>
+            <w:r>
+              <w:rPr>
+                <w:rFonts w:ascii="Times New Roman" w:cs="Times New Roman" w:eastAsia="Times New Roman" w:hAnsi="Times New Roman"/>
+                <w:b w:val="false"/>
+                <w:bCs w:val="false"/>
+                <w:i w:val="false"/>
+                <w:iCs w:val="false"/>
+                <w:sz w:val="24"/>
+                <w:szCs w:val="24"/>
+              </w:rPr>
+              <w:t xml:space="preserve">6 тиждень</w:t>
+            </w:r>
+          </w:p>
+        </w:tc>
+      </w:tr>
+      <w:tr>
+        <w:tc>
+          <w:tcPr>
+            <w:tcW w:type="pct" w:w="33%"/>
+          </w:tcPr>
+          <w:p>
+            <w:pPr>
+              <w:spacing w:after="40" w:line="360"/>
+              <w:jc w:val="left"/>
+            </w:pPr>
+            <w:r>
+              <w:rPr>
+                <w:rFonts w:ascii="Times New Roman" w:cs="Times New Roman" w:eastAsia="Times New Roman" w:hAnsi="Times New Roman"/>
+                <w:b w:val="false"/>
+                <w:bCs w:val="false"/>
+                <w:i w:val="false"/>
+                <w:iCs w:val="false"/>
+                <w:sz w:val="24"/>
+                <w:szCs w:val="24"/>
+              </w:rPr>
+              <w:t xml:space="preserve">5</w:t>
+            </w:r>
+          </w:p>
+        </w:tc>
+        <w:tc>
+          <w:tcPr>
+            <w:tcW w:type="pct" w:w="33%"/>
+          </w:tcPr>
+          <w:p>
+            <w:pPr>
+              <w:spacing w:after="40" w:line="360"/>
+              <w:jc w:val="left"/>
+            </w:pPr>
+            <w:r>
+              <w:rPr>
+                <w:rFonts w:ascii="Times New Roman" w:cs="Times New Roman" w:eastAsia="Times New Roman" w:hAnsi="Times New Roman"/>
+                <w:b w:val="false"/>
+                <w:bCs w:val="false"/>
+                <w:i w:val="false"/>
+                <w:iCs w:val="false"/>
+                <w:sz w:val="24"/>
+                <w:szCs w:val="24"/>
+              </w:rPr>
+              <w:t xml:space="preserve">Розробка механізмів отримання та оновлення даних</w:t>
+            </w:r>
+          </w:p>
+        </w:tc>
+        <w:tc>
+          <w:tcPr>
+            <w:tcW w:type="pct" w:w="33%"/>
+          </w:tcPr>
+          <w:p>
+            <w:pPr>
+              <w:spacing w:after="40" w:line="360"/>
+              <w:jc w:val="left"/>
+            </w:pPr>
+            <w:r>
+              <w:rPr>
+                <w:rFonts w:ascii="Times New Roman" w:cs="Times New Roman" w:eastAsia="Times New Roman" w:hAnsi="Times New Roman"/>
+                <w:b w:val="false"/>
+                <w:bCs w:val="false"/>
+                <w:i w:val="false"/>
+                <w:iCs w:val="false"/>
+                <w:sz w:val="24"/>
+                <w:szCs w:val="24"/>
+              </w:rPr>
+              <w:t xml:space="preserve">7–8 тижні</w:t>
+            </w:r>
+          </w:p>
+        </w:tc>
+      </w:tr>
+      <w:tr>
+        <w:tc>
+          <w:tcPr>
+            <w:tcW w:type="pct" w:w="33%"/>
+          </w:tcPr>
+          <w:p>
+            <w:pPr>
+              <w:spacing w:after="40" w:line="360"/>
+              <w:jc w:val="left"/>
+            </w:pPr>
+            <w:r>
+              <w:rPr>
+                <w:rFonts w:ascii="Times New Roman" w:cs="Times New Roman" w:eastAsia="Times New Roman" w:hAnsi="Times New Roman"/>
+                <w:b w:val="false"/>
+                <w:bCs w:val="false"/>
+                <w:i w:val="false"/>
+                <w:iCs w:val="false"/>
+                <w:sz w:val="24"/>
+                <w:szCs w:val="24"/>
+              </w:rPr>
+              <w:t xml:space="preserve">6</w:t>
+            </w:r>
+          </w:p>
+        </w:tc>
+        <w:tc>
+          <w:tcPr>
+            <w:tcW w:type="pct" w:w="33%"/>
+          </w:tcPr>
+          <w:p>
+            <w:pPr>
+              <w:spacing w:after="40" w:line="360"/>
+              <w:jc w:val="left"/>
+            </w:pPr>
+            <w:r>
+              <w:rPr>
+                <w:rFonts w:ascii="Times New Roman" w:cs="Times New Roman" w:eastAsia="Times New Roman" w:hAnsi="Times New Roman"/>
+                <w:b w:val="false"/>
+                <w:bCs w:val="false"/>
+                <w:i w:val="false"/>
+                <w:iCs w:val="false"/>
+                <w:sz w:val="24"/>
+                <w:szCs w:val="24"/>
+              </w:rPr>
+              <w:t xml:space="preserve">Розробка бази даних</w:t>
+            </w:r>
+          </w:p>
+        </w:tc>
+        <w:tc>
+          <w:tcPr>
+            <w:tcW w:type="pct" w:w="33%"/>
+          </w:tcPr>
+          <w:p>
+            <w:pPr>
+              <w:spacing w:after="40" w:line="360"/>
+              <w:jc w:val="left"/>
+            </w:pPr>
+            <w:r>
+              <w:rPr>
+                <w:rFonts w:ascii="Times New Roman" w:cs="Times New Roman" w:eastAsia="Times New Roman" w:hAnsi="Times New Roman"/>
+                <w:b w:val="false"/>
+                <w:bCs w:val="false"/>
+                <w:i w:val="false"/>
+                <w:iCs w:val="false"/>
+                <w:sz w:val="24"/>
+                <w:szCs w:val="24"/>
+              </w:rPr>
+              <w:t xml:space="preserve">9 тиждень</w:t>
+            </w:r>
+          </w:p>
+        </w:tc>
+      </w:tr>
+      <w:tr>
+        <w:tc>
+          <w:tcPr>
+            <w:tcW w:type="pct" w:w="33%"/>
+          </w:tcPr>
+          <w:p>
+            <w:pPr>
+              <w:spacing w:after="40" w:line="360"/>
+              <w:jc w:val="left"/>
+            </w:pPr>
+            <w:r>
+              <w:rPr>
+                <w:rFonts w:ascii="Times New Roman" w:cs="Times New Roman" w:eastAsia="Times New Roman" w:hAnsi="Times New Roman"/>
+                <w:b w:val="false"/>
+                <w:bCs w:val="false"/>
+                <w:i w:val="false"/>
+                <w:iCs w:val="false"/>
+                <w:sz w:val="24"/>
+                <w:szCs w:val="24"/>
+              </w:rPr>
+              <w:t xml:space="preserve">7</w:t>
+            </w:r>
+          </w:p>
+        </w:tc>
+        <w:tc>
+          <w:tcPr>
+            <w:tcW w:type="pct" w:w="33%"/>
+          </w:tcPr>
+          <w:p>
+            <w:pPr>
+              <w:spacing w:after="40" w:line="360"/>
+              <w:jc w:val="left"/>
+            </w:pPr>
+            <w:r>
+              <w:rPr>
+                <w:rFonts w:ascii="Times New Roman" w:cs="Times New Roman" w:eastAsia="Times New Roman" w:hAnsi="Times New Roman"/>
+                <w:b w:val="false"/>
+                <w:bCs w:val="false"/>
+                <w:i w:val="false"/>
+                <w:iCs w:val="false"/>
+                <w:sz w:val="24"/>
+                <w:szCs w:val="24"/>
+              </w:rPr>
+              <w:t xml:space="preserve">Інтеграція сторонніх сервісів</w:t>
+            </w:r>
+          </w:p>
+        </w:tc>
+        <w:tc>
+          <w:tcPr>
+            <w:tcW w:type="pct" w:w="33%"/>
+          </w:tcPr>
+          <w:p>
+            <w:pPr>
+              <w:spacing w:after="40" w:line="360"/>
+              <w:jc w:val="left"/>
+            </w:pPr>
+            <w:r>
+              <w:rPr>
+                <w:rFonts w:ascii="Times New Roman" w:cs="Times New Roman" w:eastAsia="Times New Roman" w:hAnsi="Times New Roman"/>
+                <w:b w:val="false"/>
+                <w:bCs w:val="false"/>
+                <w:i w:val="false"/>
+                <w:iCs w:val="false"/>
+                <w:sz w:val="24"/>
+                <w:szCs w:val="24"/>
+              </w:rPr>
+              <w:t xml:space="preserve">10–11 тижні</w:t>
+            </w:r>
+          </w:p>
+        </w:tc>
+      </w:tr>
+      <w:tr>
+        <w:tc>
+          <w:tcPr>
+            <w:tcW w:type="pct" w:w="33%"/>
+          </w:tcPr>
+          <w:p>
+            <w:pPr>
+              <w:spacing w:after="40" w:line="360"/>
+              <w:jc w:val="left"/>
+            </w:pPr>
+            <w:r>
+              <w:rPr>
+                <w:rFonts w:ascii="Times New Roman" w:cs="Times New Roman" w:eastAsia="Times New Roman" w:hAnsi="Times New Roman"/>
+                <w:b w:val="false"/>
+                <w:bCs w:val="false"/>
+                <w:i w:val="false"/>
+                <w:iCs w:val="false"/>
+                <w:sz w:val="24"/>
+                <w:szCs w:val="24"/>
+              </w:rPr>
+              <w:t xml:space="preserve">8</w:t>
+            </w:r>
+          </w:p>
+        </w:tc>
+        <w:tc>
+          <w:tcPr>
+            <w:tcW w:type="pct" w:w="33%"/>
+          </w:tcPr>
+          <w:p>
+            <w:pPr>
+              <w:spacing w:after="40" w:line="360"/>
+              <w:jc w:val="left"/>
+            </w:pPr>
+            <w:r>
+              <w:rPr>
+                <w:rFonts w:ascii="Times New Roman" w:cs="Times New Roman" w:eastAsia="Times New Roman" w:hAnsi="Times New Roman"/>
+                <w:b w:val="false"/>
+                <w:bCs w:val="false"/>
+                <w:i w:val="false"/>
+                <w:iCs w:val="false"/>
+                <w:sz w:val="24"/>
+                <w:szCs w:val="24"/>
+              </w:rPr>
+              <w:t xml:space="preserve">Створення серверної архітектури</w:t>
+            </w:r>
+          </w:p>
+        </w:tc>
+        <w:tc>
+          <w:tcPr>
+            <w:tcW w:type="pct" w:w="33%"/>
+          </w:tcPr>
+          <w:p>
+            <w:pPr>
+              <w:spacing w:after="40" w:line="360"/>
+              <w:jc w:val="left"/>
+            </w:pPr>
+            <w:r>
+              <w:rPr>
+                <w:rFonts w:ascii="Times New Roman" w:cs="Times New Roman" w:eastAsia="Times New Roman" w:hAnsi="Times New Roman"/>
+                <w:b w:val="false"/>
+                <w:bCs w:val="false"/>
+                <w:i w:val="false"/>
+                <w:iCs w:val="false"/>
+                <w:sz w:val="24"/>
+                <w:szCs w:val="24"/>
+              </w:rPr>
+              <w:t xml:space="preserve">12–13 тижні</w:t>
+            </w:r>
+          </w:p>
+        </w:tc>
+      </w:tr>
+      <w:tr>
+        <w:tc>
+          <w:tcPr>
+            <w:tcW w:type="pct" w:w="33%"/>
+          </w:tcPr>
+          <w:p>
+            <w:pPr>
+              <w:spacing w:after="40" w:line="360"/>
+              <w:jc w:val="left"/>
+            </w:pPr>
+            <w:r>
+              <w:rPr>
+                <w:rFonts w:ascii="Times New Roman" w:cs="Times New Roman" w:eastAsia="Times New Roman" w:hAnsi="Times New Roman"/>
+                <w:b w:val="false"/>
+                <w:bCs w:val="false"/>
+                <w:i w:val="false"/>
+                <w:iCs w:val="false"/>
+                <w:sz w:val="24"/>
+                <w:szCs w:val="24"/>
+              </w:rPr>
+              <w:t xml:space="preserve">9</w:t>
+            </w:r>
+          </w:p>
+        </w:tc>
+        <w:tc>
+          <w:tcPr>
+            <w:tcW w:type="pct" w:w="33%"/>
+          </w:tcPr>
+          <w:p>
+            <w:pPr>
+              <w:spacing w:after="40" w:line="360"/>
+              <w:jc w:val="left"/>
+            </w:pPr>
+            <w:r>
+              <w:rPr>
+                <w:rFonts w:ascii="Times New Roman" w:cs="Times New Roman" w:eastAsia="Times New Roman" w:hAnsi="Times New Roman"/>
+                <w:b w:val="false"/>
+                <w:bCs w:val="false"/>
+                <w:i w:val="false"/>
+                <w:iCs w:val="false"/>
+                <w:sz w:val="24"/>
+                <w:szCs w:val="24"/>
+              </w:rPr>
+              <w:t xml:space="preserve">Реалізація обробки запитів та взаємодії з БД</w:t>
+            </w:r>
+          </w:p>
+        </w:tc>
+        <w:tc>
+          <w:tcPr>
+            <w:tcW w:type="pct" w:w="33%"/>
+          </w:tcPr>
+          <w:p>
+            <w:pPr>
+              <w:spacing w:after="40" w:line="360"/>
+              <w:jc w:val="left"/>
+            </w:pPr>
+            <w:r>
+              <w:rPr>
+                <w:rFonts w:ascii="Times New Roman" w:cs="Times New Roman" w:eastAsia="Times New Roman" w:hAnsi="Times New Roman"/>
+                <w:b w:val="false"/>
+                <w:bCs w:val="false"/>
+                <w:i w:val="false"/>
+                <w:iCs w:val="false"/>
+                <w:sz w:val="24"/>
+                <w:szCs w:val="24"/>
+              </w:rPr>
+              <w:t xml:space="preserve">14–15 тижні</w:t>
+            </w:r>
+          </w:p>
+        </w:tc>
+      </w:tr>
+      <w:tr>
+        <w:tc>
+          <w:tcPr>
+            <w:tcW w:type="pct" w:w="33%"/>
+          </w:tcPr>
+          <w:p>
+            <w:pPr>
+              <w:spacing w:after="40" w:line="360"/>
+              <w:jc w:val="left"/>
+            </w:pPr>
+            <w:r>
+              <w:rPr>
+                <w:rFonts w:ascii="Times New Roman" w:cs="Times New Roman" w:eastAsia="Times New Roman" w:hAnsi="Times New Roman"/>
+                <w:b w:val="false"/>
+                <w:bCs w:val="false"/>
+                <w:i w:val="false"/>
+                <w:iCs w:val="false"/>
+                <w:sz w:val="24"/>
+                <w:szCs w:val="24"/>
+              </w:rPr>
+              <w:t xml:space="preserve">10</w:t>
+            </w:r>
+          </w:p>
+        </w:tc>
+        <w:tc>
+          <w:tcPr>
+            <w:tcW w:type="pct" w:w="33%"/>
+          </w:tcPr>
+          <w:p>
+            <w:pPr>
+              <w:spacing w:after="40" w:line="360"/>
+              <w:jc w:val="left"/>
+            </w:pPr>
+            <w:r>
+              <w:rPr>
+                <w:rFonts w:ascii="Times New Roman" w:cs="Times New Roman" w:eastAsia="Times New Roman" w:hAnsi="Times New Roman"/>
+                <w:b w:val="false"/>
+                <w:bCs w:val="false"/>
+                <w:i w:val="false"/>
+                <w:iCs w:val="false"/>
+                <w:sz w:val="24"/>
+                <w:szCs w:val="24"/>
+              </w:rPr>
+              <w:t xml:space="preserve">Тестування та налаштування</w:t>
+            </w:r>
+          </w:p>
+        </w:tc>
+        <w:tc>
+          <w:tcPr>
+            <w:tcW w:type="pct" w:w="33%"/>
+          </w:tcPr>
+          <w:p>
+            <w:pPr>
+              <w:spacing w:after="40" w:line="360"/>
+              <w:jc w:val="left"/>
+            </w:pPr>
+            <w:r>
+              <w:rPr>
+                <w:rFonts w:ascii="Times New Roman" w:cs="Times New Roman" w:eastAsia="Times New Roman" w:hAnsi="Times New Roman"/>
+                <w:b w:val="false"/>
+                <w:bCs w:val="false"/>
+                <w:i w:val="false"/>
+                <w:iCs w:val="false"/>
+                <w:sz w:val="24"/>
+                <w:szCs w:val="24"/>
+              </w:rPr>
+              <w:t xml:space="preserve">16 тиждень</w:t>
+            </w:r>
+          </w:p>
+        </w:tc>
+      </w:tr>
+    </w:tbl>
+    <w:p>
+      <w:pPr>
+        <w:spacing w:line="360"/>
+      </w:pPr>
+      <w:r>
+        <w:rPr>
+          <w:rFonts w:ascii="Times New Roman" w:cs="Times New Roman" w:eastAsia="Times New Roman" w:hAnsi="Times New Roman"/>
+          <w:b w:val="false"/>
+          <w:bCs w:val="false"/>
+          <w:i w:val="false"/>
+          <w:iCs w:val="false"/>
+          <w:sz w:val="28"/>
+          <w:szCs w:val="28"/>
+        </w:rPr>
+        <w:t xml:space="preserve"/>
+      </w:r>
+    </w:p>
+    <w:p>
+      <w:pPr>
+        <w:spacing w:line="360"/>
+      </w:pPr>
+      <w:r>
+        <w:rPr>
+          <w:rFonts w:ascii="Times New Roman" w:cs="Times New Roman" w:eastAsia="Times New Roman" w:hAnsi="Times New Roman"/>
+          <w:b w:val="false"/>
+          <w:bCs w:val="false"/>
+          <w:i w:val="false"/>
+          <w:iCs w:val="false"/>
+          <w:sz w:val="28"/>
+          <w:szCs w:val="28"/>
+        </w:rPr>
+        <w:t xml:space="preserve"/>
+      </w:r>
+    </w:p>
+    <w:p>
+      <w:pPr>
+        <w:spacing w:after="40" w:line="360"/>
+        <w:jc w:val="both"/>
+      </w:pPr>
+      <w:r>
+        <w:rPr>
+          <w:rFonts w:ascii="Times New Roman" w:cs="Times New Roman" w:eastAsia="Times New Roman" w:hAnsi="Times New Roman"/>
+          <w:b w:val="false"/>
+          <w:bCs w:val="false"/>
+          <w:i w:val="false"/>
+          <w:iCs w:val="false"/>
+          <w:sz w:val="28"/>
+          <w:szCs w:val="28"/>
+        </w:rPr>
+        <w:t xml:space="preserve">Студент            _________                 Степаненко Н. Ю.</w:t>
+      </w:r>
+    </w:p>
+    <w:p>
+      <w:pPr>
+        <w:spacing w:after="40" w:line="360"/>
+        <w:jc w:val="both"/>
+      </w:pPr>
+      <w:r>
+        <w:rPr>
+          <w:rFonts w:ascii="Times New Roman" w:cs="Times New Roman" w:eastAsia="Times New Roman" w:hAnsi="Times New Roman"/>
+          <w:b w:val="false"/>
+          <w:bCs w:val="false"/>
+          <w:i w:val="false"/>
+          <w:iCs w:val="false"/>
+          <w:sz w:val="28"/>
+          <w:szCs w:val="28"/>
+        </w:rPr>
+        <w:t xml:space="preserve">Керівник курсової роботи           _________     Недашківський О. Л.</w:t>
       </w:r>
     </w:p>
     <w:p>
@@ -522,322 +1804,81 @@
           <w:sz w:val="32"/>
           <w:szCs w:val="32"/>
         </w:rPr>
-        <w:t xml:space="preserve">ЗМІСТ</w:t>
-      </w:r>
-    </w:p>
-    <w:p>
-      <w:pPr>
-        <w:spacing w:after="120" w:line="360"/>
-        <w:ind w:firstLine="708"/>
-        <w:jc w:val="both"/>
-      </w:pPr>
-      <w:r>
-        <w:rPr>
-          <w:rFonts w:ascii="Times New Roman" w:cs="Times New Roman" w:eastAsia="Times New Roman" w:hAnsi="Times New Roman"/>
-          <w:b w:val="false"/>
-          <w:bCs w:val="false"/>
-          <w:i w:val="false"/>
-          <w:iCs w:val="false"/>
-          <w:sz w:val="28"/>
-          <w:szCs w:val="28"/>
-        </w:rPr>
-        <w:t xml:space="preserve">1. Створення діаграм компонентів, взаємодії та класів</w:t>
-      </w:r>
-    </w:p>
-    <w:p>
-      <w:pPr>
-        <w:spacing w:after="40" w:line="360"/>
-        <w:jc w:val="both"/>
-      </w:pPr>
-      <w:r>
-        <w:rPr>
-          <w:rFonts w:ascii="Times New Roman" w:cs="Times New Roman" w:eastAsia="Times New Roman" w:hAnsi="Times New Roman"/>
-          <w:b w:val="false"/>
-          <w:bCs w:val="false"/>
-          <w:i w:val="false"/>
-          <w:iCs w:val="false"/>
-          <w:sz w:val="28"/>
-          <w:szCs w:val="28"/>
-        </w:rPr>
-        <w:t xml:space="preserve">   1.1. Діаграма компонентів</w:t>
-      </w:r>
-    </w:p>
-    <w:p>
-      <w:pPr>
-        <w:spacing w:after="40" w:line="360"/>
-        <w:jc w:val="both"/>
-      </w:pPr>
-      <w:r>
-        <w:rPr>
-          <w:rFonts w:ascii="Times New Roman" w:cs="Times New Roman" w:eastAsia="Times New Roman" w:hAnsi="Times New Roman"/>
-          <w:b w:val="false"/>
-          <w:bCs w:val="false"/>
-          <w:i w:val="false"/>
-          <w:iCs w:val="false"/>
-          <w:sz w:val="28"/>
-          <w:szCs w:val="28"/>
-        </w:rPr>
-        <w:t xml:space="preserve">   1.2. Діаграма взаємодії</w:t>
-      </w:r>
-    </w:p>
-    <w:p>
-      <w:pPr>
-        <w:spacing w:after="40" w:line="360"/>
-        <w:jc w:val="both"/>
-      </w:pPr>
-      <w:r>
-        <w:rPr>
-          <w:rFonts w:ascii="Times New Roman" w:cs="Times New Roman" w:eastAsia="Times New Roman" w:hAnsi="Times New Roman"/>
-          <w:b w:val="false"/>
-          <w:bCs w:val="false"/>
-          <w:i w:val="false"/>
-          <w:iCs w:val="false"/>
-          <w:sz w:val="28"/>
-          <w:szCs w:val="28"/>
-        </w:rPr>
-        <w:t xml:space="preserve">   1.3. Діаграма класів</w:t>
-      </w:r>
-    </w:p>
-    <w:p>
-      <w:pPr>
-        <w:spacing w:after="120" w:line="360"/>
-        <w:ind w:firstLine="708"/>
-        <w:jc w:val="both"/>
-      </w:pPr>
-      <w:r>
-        <w:rPr>
-          <w:rFonts w:ascii="Times New Roman" w:cs="Times New Roman" w:eastAsia="Times New Roman" w:hAnsi="Times New Roman"/>
-          <w:b w:val="false"/>
-          <w:bCs w:val="false"/>
-          <w:i w:val="false"/>
-          <w:iCs w:val="false"/>
-          <w:sz w:val="28"/>
-          <w:szCs w:val="28"/>
-        </w:rPr>
-        <w:t xml:space="preserve">2. Проектування структури меню</w:t>
-      </w:r>
-    </w:p>
-    <w:p>
-      <w:pPr>
-        <w:spacing w:after="40" w:line="360"/>
-        <w:jc w:val="both"/>
-      </w:pPr>
-      <w:r>
-        <w:rPr>
-          <w:rFonts w:ascii="Times New Roman" w:cs="Times New Roman" w:eastAsia="Times New Roman" w:hAnsi="Times New Roman"/>
-          <w:b w:val="false"/>
-          <w:bCs w:val="false"/>
-          <w:i w:val="false"/>
-          <w:iCs w:val="false"/>
-          <w:sz w:val="28"/>
-          <w:szCs w:val="28"/>
-        </w:rPr>
-        <w:t xml:space="preserve">   2.1. Загальна структура навігації</w:t>
-      </w:r>
-    </w:p>
-    <w:p>
-      <w:pPr>
-        <w:spacing w:after="40" w:line="360"/>
-        <w:jc w:val="both"/>
-      </w:pPr>
-      <w:r>
-        <w:rPr>
-          <w:rFonts w:ascii="Times New Roman" w:cs="Times New Roman" w:eastAsia="Times New Roman" w:hAnsi="Times New Roman"/>
-          <w:b w:val="false"/>
-          <w:bCs w:val="false"/>
-          <w:i w:val="false"/>
-          <w:iCs w:val="false"/>
-          <w:sz w:val="28"/>
-          <w:szCs w:val="28"/>
-        </w:rPr>
-        <w:t xml:space="preserve">   2.2. Обґрунтування вибору структури меню</w:t>
-      </w:r>
-    </w:p>
-    <w:p>
-      <w:pPr>
-        <w:spacing w:after="120" w:line="360"/>
-        <w:ind w:firstLine="708"/>
-        <w:jc w:val="both"/>
-      </w:pPr>
-      <w:r>
-        <w:rPr>
-          <w:rFonts w:ascii="Times New Roman" w:cs="Times New Roman" w:eastAsia="Times New Roman" w:hAnsi="Times New Roman"/>
-          <w:b w:val="false"/>
-          <w:bCs w:val="false"/>
-          <w:i w:val="false"/>
-          <w:iCs w:val="false"/>
-          <w:sz w:val="28"/>
-          <w:szCs w:val="28"/>
-        </w:rPr>
-        <w:t xml:space="preserve">3. Розміщення та стилізація елементів інтерфейсу</w:t>
-      </w:r>
-    </w:p>
-    <w:p>
-      <w:pPr>
-        <w:spacing w:after="40" w:line="360"/>
-        <w:jc w:val="both"/>
-      </w:pPr>
-      <w:r>
-        <w:rPr>
-          <w:rFonts w:ascii="Times New Roman" w:cs="Times New Roman" w:eastAsia="Times New Roman" w:hAnsi="Times New Roman"/>
-          <w:b w:val="false"/>
-          <w:bCs w:val="false"/>
-          <w:i w:val="false"/>
-          <w:iCs w:val="false"/>
-          <w:sz w:val="28"/>
-          <w:szCs w:val="28"/>
-        </w:rPr>
-        <w:t xml:space="preserve">   3.1. Технології стилізації</w:t>
-      </w:r>
-    </w:p>
-    <w:p>
-      <w:pPr>
-        <w:spacing w:after="40" w:line="360"/>
-        <w:jc w:val="both"/>
-      </w:pPr>
-      <w:r>
-        <w:rPr>
-          <w:rFonts w:ascii="Times New Roman" w:cs="Times New Roman" w:eastAsia="Times New Roman" w:hAnsi="Times New Roman"/>
-          <w:b w:val="false"/>
-          <w:bCs w:val="false"/>
-          <w:i w:val="false"/>
-          <w:iCs w:val="false"/>
-          <w:sz w:val="28"/>
-          <w:szCs w:val="28"/>
-        </w:rPr>
-        <w:t xml:space="preserve">   3.2. Майстер-шаблон (layout)</w:t>
-      </w:r>
-    </w:p>
-    <w:p>
-      <w:pPr>
-        <w:spacing w:after="40" w:line="360"/>
-        <w:jc w:val="both"/>
-      </w:pPr>
-      <w:r>
-        <w:rPr>
-          <w:rFonts w:ascii="Times New Roman" w:cs="Times New Roman" w:eastAsia="Times New Roman" w:hAnsi="Times New Roman"/>
-          <w:b w:val="false"/>
-          <w:bCs w:val="false"/>
-          <w:i w:val="false"/>
-          <w:iCs w:val="false"/>
-          <w:sz w:val="28"/>
-          <w:szCs w:val="28"/>
-        </w:rPr>
-        <w:t xml:space="preserve">   3.3. Компоненти інтерфейсу</w:t>
-      </w:r>
-    </w:p>
-    <w:p>
-      <w:pPr>
-        <w:spacing w:after="40" w:line="360"/>
-        <w:jc w:val="both"/>
-      </w:pPr>
-      <w:r>
-        <w:rPr>
-          <w:rFonts w:ascii="Times New Roman" w:cs="Times New Roman" w:eastAsia="Times New Roman" w:hAnsi="Times New Roman"/>
-          <w:b w:val="false"/>
-          <w:bCs w:val="false"/>
-          <w:i w:val="false"/>
-          <w:iCs w:val="false"/>
-          <w:sz w:val="28"/>
-          <w:szCs w:val="28"/>
-        </w:rPr>
-        <w:t xml:space="preserve">   3.4. Адаптивний дизайн</w:t>
-      </w:r>
-    </w:p>
-    <w:p>
-      <w:pPr>
-        <w:spacing w:after="120" w:line="360"/>
-        <w:ind w:firstLine="708"/>
-        <w:jc w:val="both"/>
-      </w:pPr>
-      <w:r>
-        <w:rPr>
-          <w:rFonts w:ascii="Times New Roman" w:cs="Times New Roman" w:eastAsia="Times New Roman" w:hAnsi="Times New Roman"/>
-          <w:b w:val="false"/>
-          <w:bCs w:val="false"/>
-          <w:i w:val="false"/>
-          <w:iCs w:val="false"/>
-          <w:sz w:val="28"/>
-          <w:szCs w:val="28"/>
-        </w:rPr>
-        <w:t xml:space="preserve">4. Модель даних та її реалізація</w:t>
-      </w:r>
-    </w:p>
-    <w:p>
-      <w:pPr>
-        <w:spacing w:after="40" w:line="360"/>
-        <w:jc w:val="both"/>
-      </w:pPr>
-      <w:r>
-        <w:rPr>
-          <w:rFonts w:ascii="Times New Roman" w:cs="Times New Roman" w:eastAsia="Times New Roman" w:hAnsi="Times New Roman"/>
-          <w:b w:val="false"/>
-          <w:bCs w:val="false"/>
-          <w:i w:val="false"/>
-          <w:iCs w:val="false"/>
-          <w:sz w:val="28"/>
-          <w:szCs w:val="28"/>
-        </w:rPr>
-        <w:t xml:space="preserve">   4.1. Обрана СКБД</w:t>
-      </w:r>
-    </w:p>
-    <w:p>
-      <w:pPr>
-        <w:spacing w:after="40" w:line="360"/>
-        <w:jc w:val="both"/>
-      </w:pPr>
-      <w:r>
-        <w:rPr>
-          <w:rFonts w:ascii="Times New Roman" w:cs="Times New Roman" w:eastAsia="Times New Roman" w:hAnsi="Times New Roman"/>
-          <w:b w:val="false"/>
-          <w:bCs w:val="false"/>
-          <w:i w:val="false"/>
-          <w:iCs w:val="false"/>
-          <w:sz w:val="28"/>
-          <w:szCs w:val="28"/>
-        </w:rPr>
-        <w:t xml:space="preserve">   4.2. Схема бази даних</w:t>
-      </w:r>
-    </w:p>
-    <w:p>
-      <w:pPr>
-        <w:spacing w:after="40" w:line="360"/>
-        <w:jc w:val="both"/>
-      </w:pPr>
-      <w:r>
-        <w:rPr>
-          <w:rFonts w:ascii="Times New Roman" w:cs="Times New Roman" w:eastAsia="Times New Roman" w:hAnsi="Times New Roman"/>
-          <w:b w:val="false"/>
-          <w:bCs w:val="false"/>
-          <w:i w:val="false"/>
-          <w:iCs w:val="false"/>
-          <w:sz w:val="28"/>
-          <w:szCs w:val="28"/>
-        </w:rPr>
-        <w:t xml:space="preserve">   4.3. Зв'язки між таблицями</w:t>
-      </w:r>
-    </w:p>
-    <w:p>
-      <w:pPr>
-        <w:spacing w:after="40" w:line="360"/>
-        <w:jc w:val="both"/>
-      </w:pPr>
-      <w:r>
-        <w:rPr>
-          <w:rFonts w:ascii="Times New Roman" w:cs="Times New Roman" w:eastAsia="Times New Roman" w:hAnsi="Times New Roman"/>
-          <w:b w:val="false"/>
-          <w:bCs w:val="false"/>
-          <w:i w:val="false"/>
-          <w:iCs w:val="false"/>
-          <w:sz w:val="28"/>
-          <w:szCs w:val="28"/>
-        </w:rPr>
-        <w:t xml:space="preserve">   4.4. Ініціалізація бази даних</w:t>
-      </w:r>
-    </w:p>
-    <w:p>
-      <w:r>
-        <w:br w:type="page"/>
+        <w:t xml:space="preserve">АНОТАЦІЯ</w:t>
+      </w:r>
+    </w:p>
+    <w:p>
+      <w:pPr>
+        <w:spacing w:after="120" w:line="360"/>
+        <w:ind w:firstLine="708"/>
+        <w:jc w:val="both"/>
+      </w:pPr>
+      <w:r>
+        <w:rPr>
+          <w:rFonts w:ascii="Times New Roman" w:cs="Times New Roman" w:eastAsia="Times New Roman" w:hAnsi="Times New Roman"/>
+          <w:b w:val="false"/>
+          <w:bCs w:val="false"/>
+          <w:i w:val="false"/>
+          <w:iCs w:val="false"/>
+          <w:sz w:val="28"/>
+          <w:szCs w:val="28"/>
+        </w:rPr>
+        <w:t xml:space="preserve">У ході виконання курсової роботи розробляється веб-додаток для персонального фінансового менеджменту з використанням стеку технологій Node.js 20, Express 4, SQLite (better-sqlite3), Bootstrap 5, Chart.js. Додаток дозволяє користувачам реєструватись та авторизуватись, керувати фінансовими рахунками, категоризувати транзакції, встановлювати місячні бюджети та візуалізувати фінансовий стан через інтерактивні графіки.</w:t>
+      </w:r>
+    </w:p>
+    <w:p>
+      <w:pPr>
+        <w:spacing w:after="120" w:line="360"/>
+        <w:ind w:firstLine="708"/>
+        <w:jc w:val="both"/>
+      </w:pPr>
+      <w:r>
+        <w:rPr>
+          <w:rFonts w:ascii="Times New Roman" w:cs="Times New Roman" w:eastAsia="Times New Roman" w:hAnsi="Times New Roman"/>
+          <w:b w:val="false"/>
+          <w:bCs w:val="false"/>
+          <w:i w:val="false"/>
+          <w:iCs w:val="false"/>
+          <w:sz w:val="28"/>
+          <w:szCs w:val="28"/>
+        </w:rPr>
+        <w:t xml:space="preserve">Проект розробляється командою з двох осіб з розподілом за функціональними модулями. Автор даного звіту відповідає за модулі авторизації, рахунків/гаманців, дашборду, графіків та інтеграції з API.</w:t>
+      </w:r>
+    </w:p>
+    <w:p>
+      <w:pPr>
+        <w:spacing w:after="120" w:line="360"/>
+        <w:ind w:firstLine="708"/>
+        <w:jc w:val="both"/>
+      </w:pPr>
+      <w:r>
+        <w:rPr>
+          <w:rFonts w:ascii="Times New Roman" w:cs="Times New Roman" w:eastAsia="Times New Roman" w:hAnsi="Times New Roman"/>
+          <w:b w:val="false"/>
+          <w:bCs w:val="false"/>
+          <w:i w:val="false"/>
+          <w:iCs w:val="false"/>
+          <w:sz w:val="28"/>
+          <w:szCs w:val="28"/>
+        </w:rPr>
+        <w:t xml:space="preserve">У даному звіті описано роботу за пунктами 1–4: створення UML-діаграм, проектування меню, стилізація інтерфейсу та реалізація моделі даних.</w:t>
+      </w:r>
+    </w:p>
+    <w:p>
+      <w:pPr>
+        <w:spacing w:line="360"/>
+      </w:pPr>
+      <w:r>
+        <w:rPr>
+          <w:rFonts w:ascii="Times New Roman" w:cs="Times New Roman" w:eastAsia="Times New Roman" w:hAnsi="Times New Roman"/>
+          <w:b w:val="false"/>
+          <w:bCs w:val="false"/>
+          <w:i w:val="false"/>
+          <w:iCs w:val="false"/>
+          <w:sz w:val="28"/>
+          <w:szCs w:val="28"/>
+        </w:rPr>
+        <w:t xml:space="preserve"/>
       </w:r>
     </w:p>
     <w:p>
@@ -854,164 +1895,64 @@
           <w:sz w:val="32"/>
           <w:szCs w:val="32"/>
         </w:rPr>
-        <w:t xml:space="preserve">ВСТУП</w:t>
-      </w:r>
-    </w:p>
-    <w:p>
-      <w:pPr>
-        <w:spacing w:after="120" w:line="360"/>
-        <w:ind w:firstLine="708"/>
-        <w:jc w:val="both"/>
-      </w:pPr>
-      <w:r>
-        <w:rPr>
-          <w:rFonts w:ascii="Times New Roman" w:cs="Times New Roman" w:eastAsia="Times New Roman" w:hAnsi="Times New Roman"/>
-          <w:b w:val="false"/>
-          <w:bCs w:val="false"/>
-          <w:i w:val="false"/>
-          <w:iCs w:val="false"/>
-          <w:sz w:val="28"/>
-          <w:szCs w:val="28"/>
-        </w:rPr>
-        <w:t xml:space="preserve">Управління особистими фінансами є актуальною задачею для кожної людини. У сучасному світі, де обсяги фінансових транзакцій постійно зростають, виникає потреба у зручних інструментах для обліку доходів та витрат, контролю бюджету та аналізу фінансового стану.</w:t>
-      </w:r>
-    </w:p>
-    <w:p>
-      <w:pPr>
-        <w:spacing w:after="120" w:line="360"/>
-        <w:ind w:firstLine="708"/>
-        <w:jc w:val="both"/>
-      </w:pPr>
-      <w:r>
-        <w:rPr>
-          <w:rFonts w:ascii="Times New Roman" w:cs="Times New Roman" w:eastAsia="Times New Roman" w:hAnsi="Times New Roman"/>
-          <w:b w:val="false"/>
-          <w:bCs w:val="false"/>
-          <w:i w:val="false"/>
-          <w:iCs w:val="false"/>
-          <w:sz w:val="28"/>
-          <w:szCs w:val="28"/>
-        </w:rPr>
-        <w:t xml:space="preserve">Метою даної курсової роботи є розробка веб-додатку для персонального фінансового менеджменту, який дозволяє користувачам відстежувати доходи та витрати, керувати рахунками, категоризувати транзакції, встановлювати місячні бюджети та візуалізувати фінансовий стан через графіки та звіти.</w:t>
-      </w:r>
-    </w:p>
-    <w:p>
-      <w:pPr>
-        <w:spacing w:after="120" w:line="360"/>
-        <w:ind w:firstLine="708"/>
-        <w:jc w:val="both"/>
-      </w:pPr>
-      <w:r>
-        <w:rPr>
-          <w:rFonts w:ascii="Times New Roman" w:cs="Times New Roman" w:eastAsia="Times New Roman" w:hAnsi="Times New Roman"/>
-          <w:b w:val="false"/>
-          <w:bCs w:val="false"/>
-          <w:i w:val="false"/>
-          <w:iCs w:val="false"/>
-          <w:sz w:val="28"/>
-          <w:szCs w:val="28"/>
-        </w:rPr>
-        <w:t xml:space="preserve">Додаток розробляється з використанням стеку технологій: Node.js 20 LTS, Express 4, шаблонізатор EJS, база даних SQLite (бібліотека better-sqlite3), CSS-фреймворк Bootstrap 5, бібліотека Chart.js для побудови графіків.</w:t>
-      </w:r>
-    </w:p>
-    <w:p>
-      <w:pPr>
-        <w:spacing w:after="120" w:line="360"/>
-        <w:ind w:firstLine="708"/>
-        <w:jc w:val="both"/>
-      </w:pPr>
-      <w:r>
-        <w:rPr>
-          <w:rFonts w:ascii="Times New Roman" w:cs="Times New Roman" w:eastAsia="Times New Roman" w:hAnsi="Times New Roman"/>
-          <w:b w:val="false"/>
-          <w:bCs w:val="false"/>
-          <w:i w:val="false"/>
-          <w:iCs w:val="false"/>
-          <w:sz w:val="28"/>
-          <w:szCs w:val="28"/>
-        </w:rPr>
-        <w:t xml:space="preserve">Проект розробляється командою з двох осіб з розподілом за функціональними модулями:</w:t>
-      </w:r>
-    </w:p>
-    <w:p>
-      <w:pPr>
-        <w:spacing w:after="120" w:line="360"/>
-        <w:ind w:firstLine="708"/>
-        <w:jc w:val="both"/>
-      </w:pPr>
-      <w:r>
-        <w:rPr>
-          <w:rFonts w:ascii="Times New Roman" w:cs="Times New Roman" w:eastAsia="Times New Roman" w:hAnsi="Times New Roman"/>
-          <w:b/>
-          <w:bCs/>
-          <w:i w:val="false"/>
-          <w:iCs w:val="false"/>
-          <w:sz w:val="28"/>
-          <w:szCs w:val="28"/>
-        </w:rPr>
-        <w:t xml:space="preserve">Степаненко Назар</w:t>
-      </w:r>
-      <w:r>
-        <w:rPr>
-          <w:rFonts w:ascii="Times New Roman" w:cs="Times New Roman" w:eastAsia="Times New Roman" w:hAnsi="Times New Roman"/>
-          <w:b w:val="false"/>
-          <w:bCs w:val="false"/>
-          <w:i w:val="false"/>
-          <w:iCs w:val="false"/>
-          <w:sz w:val="28"/>
-          <w:szCs w:val="28"/>
-        </w:rPr>
-        <w:t xml:space="preserve"> — авторизація, рахунки/гаманці, дашборд, графіки, інтеграція з API</w:t>
-      </w:r>
-    </w:p>
-    <w:p>
-      <w:pPr>
-        <w:spacing w:after="120" w:line="360"/>
-        <w:ind w:firstLine="708"/>
-        <w:jc w:val="both"/>
-      </w:pPr>
-      <w:r>
-        <w:rPr>
-          <w:rFonts w:ascii="Times New Roman" w:cs="Times New Roman" w:eastAsia="Times New Roman" w:hAnsi="Times New Roman"/>
-          <w:b/>
-          <w:bCs/>
-          <w:i w:val="false"/>
-          <w:iCs w:val="false"/>
-          <w:sz w:val="28"/>
-          <w:szCs w:val="28"/>
-        </w:rPr>
-        <w:t xml:space="preserve">Аніщенко Артем</w:t>
-      </w:r>
-      <w:r>
-        <w:rPr>
-          <w:rFonts w:ascii="Times New Roman" w:cs="Times New Roman" w:eastAsia="Times New Roman" w:hAnsi="Times New Roman"/>
-          <w:b w:val="false"/>
-          <w:bCs w:val="false"/>
-          <w:i w:val="false"/>
-          <w:iCs w:val="false"/>
-          <w:sz w:val="28"/>
-          <w:szCs w:val="28"/>
-        </w:rPr>
-        <w:t xml:space="preserve"> — категорії, транзакції, фільтрація, бюджети, експорт</w:t>
-      </w:r>
-    </w:p>
-    <w:p>
-      <w:pPr>
-        <w:spacing w:after="120" w:line="360"/>
-        <w:ind w:firstLine="708"/>
-        <w:jc w:val="both"/>
-      </w:pPr>
-      <w:r>
-        <w:rPr>
-          <w:rFonts w:ascii="Times New Roman" w:cs="Times New Roman" w:eastAsia="Times New Roman" w:hAnsi="Times New Roman"/>
-          <w:b w:val="false"/>
-          <w:bCs w:val="false"/>
-          <w:i w:val="false"/>
-          <w:iCs w:val="false"/>
-          <w:sz w:val="28"/>
-          <w:szCs w:val="28"/>
-        </w:rPr>
-        <w:t xml:space="preserve">У даному звіті описано роботу, виконану за пунктами 1–4 силабусу: створення UML-діаграм, проектування навігаційного меню, розміщення та стилізація елементів інтерфейсу, а також проектування і реалізація моделі даних.</w:t>
+        <w:t xml:space="preserve">ANNOTATION</w:t>
+      </w:r>
+    </w:p>
+    <w:p>
+      <w:pPr>
+        <w:spacing w:after="120" w:line="360"/>
+        <w:ind w:firstLine="708"/>
+        <w:jc w:val="both"/>
+      </w:pPr>
+      <w:r>
+        <w:rPr>
+          <w:rFonts w:ascii="Times New Roman" w:cs="Times New Roman" w:eastAsia="Times New Roman" w:hAnsi="Times New Roman"/>
+          <w:b w:val="false"/>
+          <w:bCs w:val="false"/>
+          <w:i w:val="false"/>
+          <w:iCs w:val="false"/>
+          <w:sz w:val="28"/>
+          <w:szCs w:val="28"/>
+        </w:rPr>
+        <w:t xml:space="preserve">This course work involves the development of a personal finance management web application using Node.js 20, Express 4, SQLite (better-sqlite3), Bootstrap 5, and Chart.js. The application allows users to register and log in, manage financial accounts, categorize transactions, set monthly budgets, and visualize their financial status through interactive charts.</w:t>
+      </w:r>
+    </w:p>
+    <w:p>
+      <w:pPr>
+        <w:spacing w:after="120" w:line="360"/>
+        <w:ind w:firstLine="708"/>
+        <w:jc w:val="both"/>
+      </w:pPr>
+      <w:r>
+        <w:rPr>
+          <w:rFonts w:ascii="Times New Roman" w:cs="Times New Roman" w:eastAsia="Times New Roman" w:hAnsi="Times New Roman"/>
+          <w:b w:val="false"/>
+          <w:bCs w:val="false"/>
+          <w:i w:val="false"/>
+          <w:iCs w:val="false"/>
+          <w:sz w:val="28"/>
+          <w:szCs w:val="28"/>
+        </w:rPr>
+        <w:t xml:space="preserve">The project is developed by a team of two, with responsibilities divided by functional modules. The author of this report is responsible for authentication, accounts/wallets, dashboard, charts, and API integration.</w:t>
+      </w:r>
+    </w:p>
+    <w:p>
+      <w:pPr>
+        <w:spacing w:after="120" w:line="360"/>
+        <w:ind w:firstLine="708"/>
+        <w:jc w:val="both"/>
+      </w:pPr>
+      <w:r>
+        <w:rPr>
+          <w:rFonts w:ascii="Times New Roman" w:cs="Times New Roman" w:eastAsia="Times New Roman" w:hAnsi="Times New Roman"/>
+          <w:b w:val="false"/>
+          <w:bCs w:val="false"/>
+          <w:i w:val="false"/>
+          <w:iCs w:val="false"/>
+          <w:sz w:val="28"/>
+          <w:szCs w:val="28"/>
+        </w:rPr>
+        <w:t xml:space="preserve">This report covers points 1–4: creation of UML diagrams, menu structure design, UI styling, and data model implementation.</w:t>
       </w:r>
     </w:p>
     <w:p>
@@ -1033,6 +1974,585 @@
           <w:sz w:val="32"/>
           <w:szCs w:val="32"/>
         </w:rPr>
+        <w:t xml:space="preserve">ЗМІСТ</w:t>
+      </w:r>
+    </w:p>
+    <w:p>
+      <w:pPr>
+        <w:spacing w:after="40" w:line="360"/>
+        <w:jc w:val="both"/>
+      </w:pPr>
+      <w:r>
+        <w:rPr>
+          <w:rFonts w:ascii="Times New Roman" w:cs="Times New Roman" w:eastAsia="Times New Roman" w:hAnsi="Times New Roman"/>
+          <w:b w:val="false"/>
+          <w:bCs w:val="false"/>
+          <w:i w:val="false"/>
+          <w:iCs w:val="false"/>
+          <w:sz w:val="28"/>
+          <w:szCs w:val="28"/>
+        </w:rPr>
+        <w:t xml:space="preserve">АНОТАЦІЯ .................................................................................................................. 3</w:t>
+      </w:r>
+    </w:p>
+    <w:p>
+      <w:pPr>
+        <w:spacing w:after="40" w:line="360"/>
+        <w:jc w:val="both"/>
+      </w:pPr>
+      <w:r>
+        <w:rPr>
+          <w:rFonts w:ascii="Times New Roman" w:cs="Times New Roman" w:eastAsia="Times New Roman" w:hAnsi="Times New Roman"/>
+          <w:b w:val="false"/>
+          <w:bCs w:val="false"/>
+          <w:i w:val="false"/>
+          <w:iCs w:val="false"/>
+          <w:sz w:val="28"/>
+          <w:szCs w:val="28"/>
+        </w:rPr>
+        <w:t xml:space="preserve">ВСТУП ...................................................................................................................... 5</w:t>
+      </w:r>
+    </w:p>
+    <w:p>
+      <w:pPr>
+        <w:spacing w:after="40" w:line="360"/>
+        <w:jc w:val="both"/>
+      </w:pPr>
+      <w:r>
+        <w:rPr>
+          <w:rFonts w:ascii="Times New Roman" w:cs="Times New Roman" w:eastAsia="Times New Roman" w:hAnsi="Times New Roman"/>
+          <w:b w:val="false"/>
+          <w:bCs w:val="false"/>
+          <w:i w:val="false"/>
+          <w:iCs w:val="false"/>
+          <w:sz w:val="28"/>
+          <w:szCs w:val="28"/>
+        </w:rPr>
+        <w:t xml:space="preserve">РОЗДІЛ 1. Створення діаграм компонентів, взаємодії та класів ........................... 6</w:t>
+      </w:r>
+    </w:p>
+    <w:p>
+      <w:pPr>
+        <w:spacing w:after="40" w:line="360"/>
+        <w:jc w:val="both"/>
+      </w:pPr>
+      <w:r>
+        <w:rPr>
+          <w:rFonts w:ascii="Times New Roman" w:cs="Times New Roman" w:eastAsia="Times New Roman" w:hAnsi="Times New Roman"/>
+          <w:b w:val="false"/>
+          <w:bCs w:val="false"/>
+          <w:i w:val="false"/>
+          <w:iCs w:val="false"/>
+          <w:sz w:val="28"/>
+          <w:szCs w:val="28"/>
+        </w:rPr>
+        <w:t xml:space="preserve">   1.1. Діаграма компонентів .................................................................................. 6</w:t>
+      </w:r>
+    </w:p>
+    <w:p>
+      <w:pPr>
+        <w:spacing w:after="40" w:line="360"/>
+        <w:jc w:val="both"/>
+      </w:pPr>
+      <w:r>
+        <w:rPr>
+          <w:rFonts w:ascii="Times New Roman" w:cs="Times New Roman" w:eastAsia="Times New Roman" w:hAnsi="Times New Roman"/>
+          <w:b w:val="false"/>
+          <w:bCs w:val="false"/>
+          <w:i w:val="false"/>
+          <w:iCs w:val="false"/>
+          <w:sz w:val="28"/>
+          <w:szCs w:val="28"/>
+        </w:rPr>
+        <w:t xml:space="preserve">   1.2. Діаграма взаємодії ...................................................................................... 8</w:t>
+      </w:r>
+    </w:p>
+    <w:p>
+      <w:pPr>
+        <w:spacing w:after="40" w:line="360"/>
+        <w:jc w:val="both"/>
+      </w:pPr>
+      <w:r>
+        <w:rPr>
+          <w:rFonts w:ascii="Times New Roman" w:cs="Times New Roman" w:eastAsia="Times New Roman" w:hAnsi="Times New Roman"/>
+          <w:b w:val="false"/>
+          <w:bCs w:val="false"/>
+          <w:i w:val="false"/>
+          <w:iCs w:val="false"/>
+          <w:sz w:val="28"/>
+          <w:szCs w:val="28"/>
+        </w:rPr>
+        <w:t xml:space="preserve">   1.3. Діаграма класів .......................................................................................... 9</w:t>
+      </w:r>
+    </w:p>
+    <w:p>
+      <w:pPr>
+        <w:spacing w:after="40" w:line="360"/>
+        <w:jc w:val="both"/>
+      </w:pPr>
+      <w:r>
+        <w:rPr>
+          <w:rFonts w:ascii="Times New Roman" w:cs="Times New Roman" w:eastAsia="Times New Roman" w:hAnsi="Times New Roman"/>
+          <w:b w:val="false"/>
+          <w:bCs w:val="false"/>
+          <w:i w:val="false"/>
+          <w:iCs w:val="false"/>
+          <w:sz w:val="28"/>
+          <w:szCs w:val="28"/>
+        </w:rPr>
+        <w:t xml:space="preserve">РОЗДІЛ 2. Проектування структури меню .............................................................. 11</w:t>
+      </w:r>
+    </w:p>
+    <w:p>
+      <w:pPr>
+        <w:spacing w:after="40" w:line="360"/>
+        <w:jc w:val="both"/>
+      </w:pPr>
+      <w:r>
+        <w:rPr>
+          <w:rFonts w:ascii="Times New Roman" w:cs="Times New Roman" w:eastAsia="Times New Roman" w:hAnsi="Times New Roman"/>
+          <w:b w:val="false"/>
+          <w:bCs w:val="false"/>
+          <w:i w:val="false"/>
+          <w:iCs w:val="false"/>
+          <w:sz w:val="28"/>
+          <w:szCs w:val="28"/>
+        </w:rPr>
+        <w:t xml:space="preserve">   2.1. Загальна структура навігації ...................................................................... 11</w:t>
+      </w:r>
+    </w:p>
+    <w:p>
+      <w:pPr>
+        <w:spacing w:after="40" w:line="360"/>
+        <w:jc w:val="both"/>
+      </w:pPr>
+      <w:r>
+        <w:rPr>
+          <w:rFonts w:ascii="Times New Roman" w:cs="Times New Roman" w:eastAsia="Times New Roman" w:hAnsi="Times New Roman"/>
+          <w:b w:val="false"/>
+          <w:bCs w:val="false"/>
+          <w:i w:val="false"/>
+          <w:iCs w:val="false"/>
+          <w:sz w:val="28"/>
+          <w:szCs w:val="28"/>
+        </w:rPr>
+        <w:t xml:space="preserve">   2.2. Обґрунтування вибору структури меню .................................................... 12</w:t>
+      </w:r>
+    </w:p>
+    <w:p>
+      <w:pPr>
+        <w:spacing w:after="40" w:line="360"/>
+        <w:jc w:val="both"/>
+      </w:pPr>
+      <w:r>
+        <w:rPr>
+          <w:rFonts w:ascii="Times New Roman" w:cs="Times New Roman" w:eastAsia="Times New Roman" w:hAnsi="Times New Roman"/>
+          <w:b w:val="false"/>
+          <w:bCs w:val="false"/>
+          <w:i w:val="false"/>
+          <w:iCs w:val="false"/>
+          <w:sz w:val="28"/>
+          <w:szCs w:val="28"/>
+        </w:rPr>
+        <w:t xml:space="preserve">РОЗДІЛ 3. Розміщення та стилізація елементів інтерфейсу ................................. 13</w:t>
+      </w:r>
+    </w:p>
+    <w:p>
+      <w:pPr>
+        <w:spacing w:after="40" w:line="360"/>
+        <w:jc w:val="both"/>
+      </w:pPr>
+      <w:r>
+        <w:rPr>
+          <w:rFonts w:ascii="Times New Roman" w:cs="Times New Roman" w:eastAsia="Times New Roman" w:hAnsi="Times New Roman"/>
+          <w:b w:val="false"/>
+          <w:bCs w:val="false"/>
+          <w:i w:val="false"/>
+          <w:iCs w:val="false"/>
+          <w:sz w:val="28"/>
+          <w:szCs w:val="28"/>
+        </w:rPr>
+        <w:t xml:space="preserve">   3.1. Технології стилізації ................................................................................... 13</w:t>
+      </w:r>
+    </w:p>
+    <w:p>
+      <w:pPr>
+        <w:spacing w:after="40" w:line="360"/>
+        <w:jc w:val="both"/>
+      </w:pPr>
+      <w:r>
+        <w:rPr>
+          <w:rFonts w:ascii="Times New Roman" w:cs="Times New Roman" w:eastAsia="Times New Roman" w:hAnsi="Times New Roman"/>
+          <w:b w:val="false"/>
+          <w:bCs w:val="false"/>
+          <w:i w:val="false"/>
+          <w:iCs w:val="false"/>
+          <w:sz w:val="28"/>
+          <w:szCs w:val="28"/>
+        </w:rPr>
+        <w:t xml:space="preserve">   3.2. Майстер-шаблон (layout) ........................................................................... 13</w:t>
+      </w:r>
+    </w:p>
+    <w:p>
+      <w:pPr>
+        <w:spacing w:after="40" w:line="360"/>
+        <w:jc w:val="both"/>
+      </w:pPr>
+      <w:r>
+        <w:rPr>
+          <w:rFonts w:ascii="Times New Roman" w:cs="Times New Roman" w:eastAsia="Times New Roman" w:hAnsi="Times New Roman"/>
+          <w:b w:val="false"/>
+          <w:bCs w:val="false"/>
+          <w:i w:val="false"/>
+          <w:iCs w:val="false"/>
+          <w:sz w:val="28"/>
+          <w:szCs w:val="28"/>
+        </w:rPr>
+        <w:t xml:space="preserve">   3.3. Компоненти інтерфейсу ............................................................................. 14</w:t>
+      </w:r>
+    </w:p>
+    <w:p>
+      <w:pPr>
+        <w:spacing w:after="40" w:line="360"/>
+        <w:jc w:val="both"/>
+      </w:pPr>
+      <w:r>
+        <w:rPr>
+          <w:rFonts w:ascii="Times New Roman" w:cs="Times New Roman" w:eastAsia="Times New Roman" w:hAnsi="Times New Roman"/>
+          <w:b w:val="false"/>
+          <w:bCs w:val="false"/>
+          <w:i w:val="false"/>
+          <w:iCs w:val="false"/>
+          <w:sz w:val="28"/>
+          <w:szCs w:val="28"/>
+        </w:rPr>
+        <w:t xml:space="preserve">   3.4. Адаптивний дизайн .................................................................................... 17</w:t>
+      </w:r>
+    </w:p>
+    <w:p>
+      <w:pPr>
+        <w:spacing w:after="40" w:line="360"/>
+        <w:jc w:val="both"/>
+      </w:pPr>
+      <w:r>
+        <w:rPr>
+          <w:rFonts w:ascii="Times New Roman" w:cs="Times New Roman" w:eastAsia="Times New Roman" w:hAnsi="Times New Roman"/>
+          <w:b w:val="false"/>
+          <w:bCs w:val="false"/>
+          <w:i w:val="false"/>
+          <w:iCs w:val="false"/>
+          <w:sz w:val="28"/>
+          <w:szCs w:val="28"/>
+        </w:rPr>
+        <w:t xml:space="preserve">РОЗДІЛ 4. Модель даних та її реалізація ............................................................... 19</w:t>
+      </w:r>
+    </w:p>
+    <w:p>
+      <w:pPr>
+        <w:spacing w:after="40" w:line="360"/>
+        <w:jc w:val="both"/>
+      </w:pPr>
+      <w:r>
+        <w:rPr>
+          <w:rFonts w:ascii="Times New Roman" w:cs="Times New Roman" w:eastAsia="Times New Roman" w:hAnsi="Times New Roman"/>
+          <w:b w:val="false"/>
+          <w:bCs w:val="false"/>
+          <w:i w:val="false"/>
+          <w:iCs w:val="false"/>
+          <w:sz w:val="28"/>
+          <w:szCs w:val="28"/>
+        </w:rPr>
+        <w:t xml:space="preserve">   4.1. Обрана СКБД ............................................................................................. 19</w:t>
+      </w:r>
+    </w:p>
+    <w:p>
+      <w:pPr>
+        <w:spacing w:after="40" w:line="360"/>
+        <w:jc w:val="both"/>
+      </w:pPr>
+      <w:r>
+        <w:rPr>
+          <w:rFonts w:ascii="Times New Roman" w:cs="Times New Roman" w:eastAsia="Times New Roman" w:hAnsi="Times New Roman"/>
+          <w:b w:val="false"/>
+          <w:bCs w:val="false"/>
+          <w:i w:val="false"/>
+          <w:iCs w:val="false"/>
+          <w:sz w:val="28"/>
+          <w:szCs w:val="28"/>
+        </w:rPr>
+        <w:t xml:space="preserve">   4.2. Схема бази даних ...................................................................................... 19</w:t>
+      </w:r>
+    </w:p>
+    <w:p>
+      <w:pPr>
+        <w:spacing w:after="40" w:line="360"/>
+        <w:jc w:val="both"/>
+      </w:pPr>
+      <w:r>
+        <w:rPr>
+          <w:rFonts w:ascii="Times New Roman" w:cs="Times New Roman" w:eastAsia="Times New Roman" w:hAnsi="Times New Roman"/>
+          <w:b w:val="false"/>
+          <w:bCs w:val="false"/>
+          <w:i w:val="false"/>
+          <w:iCs w:val="false"/>
+          <w:sz w:val="28"/>
+          <w:szCs w:val="28"/>
+        </w:rPr>
+        <w:t xml:space="preserve">   4.3. Зв'язки між таблицями .............................................................................. 21</w:t>
+      </w:r>
+    </w:p>
+    <w:p>
+      <w:pPr>
+        <w:spacing w:after="40" w:line="360"/>
+        <w:jc w:val="both"/>
+      </w:pPr>
+      <w:r>
+        <w:rPr>
+          <w:rFonts w:ascii="Times New Roman" w:cs="Times New Roman" w:eastAsia="Times New Roman" w:hAnsi="Times New Roman"/>
+          <w:b w:val="false"/>
+          <w:bCs w:val="false"/>
+          <w:i w:val="false"/>
+          <w:iCs w:val="false"/>
+          <w:sz w:val="28"/>
+          <w:szCs w:val="28"/>
+        </w:rPr>
+        <w:t xml:space="preserve">   4.4. Ініціалізація бази даних ............................................................................. 22</w:t>
+      </w:r>
+    </w:p>
+    <w:p>
+      <w:pPr>
+        <w:spacing w:after="40" w:line="360"/>
+        <w:jc w:val="both"/>
+      </w:pPr>
+      <w:r>
+        <w:rPr>
+          <w:rFonts w:ascii="Times New Roman" w:cs="Times New Roman" w:eastAsia="Times New Roman" w:hAnsi="Times New Roman"/>
+          <w:b w:val="false"/>
+          <w:bCs w:val="false"/>
+          <w:i w:val="false"/>
+          <w:iCs w:val="false"/>
+          <w:sz w:val="28"/>
+          <w:szCs w:val="28"/>
+        </w:rPr>
+        <w:t xml:space="preserve">ВИСНОВКИ .............................................................................................................. 23</w:t>
+      </w:r>
+    </w:p>
+    <w:p>
+      <w:pPr>
+        <w:spacing w:after="40" w:line="360"/>
+        <w:jc w:val="both"/>
+      </w:pPr>
+      <w:r>
+        <w:rPr>
+          <w:rFonts w:ascii="Times New Roman" w:cs="Times New Roman" w:eastAsia="Times New Roman" w:hAnsi="Times New Roman"/>
+          <w:b w:val="false"/>
+          <w:bCs w:val="false"/>
+          <w:i w:val="false"/>
+          <w:iCs w:val="false"/>
+          <w:sz w:val="28"/>
+          <w:szCs w:val="28"/>
+        </w:rPr>
+        <w:t xml:space="preserve">СПИСОК ВИКОРИСТАНИХ ДЖЕРЕЛ ...................................................................... 24</w:t>
+      </w:r>
+    </w:p>
+    <w:p>
+      <w:r>
+        <w:br w:type="page"/>
+      </w:r>
+    </w:p>
+    <w:p>
+      <w:pPr>
+        <w:pStyle w:val="Heading1"/>
+        <w:spacing w:after="200" w:before="240" w:line="360"/>
+        <w:jc w:val="center"/>
+      </w:pPr>
+      <w:r>
+        <w:rPr>
+          <w:rFonts w:ascii="Times New Roman" w:cs="Times New Roman" w:eastAsia="Times New Roman" w:hAnsi="Times New Roman"/>
+          <w:b/>
+          <w:bCs/>
+          <w:sz w:val="32"/>
+          <w:szCs w:val="32"/>
+        </w:rPr>
+        <w:t xml:space="preserve">ВСТУП</w:t>
+      </w:r>
+    </w:p>
+    <w:p>
+      <w:pPr>
+        <w:spacing w:after="120" w:line="360"/>
+        <w:ind w:firstLine="708"/>
+        <w:jc w:val="both"/>
+      </w:pPr>
+      <w:r>
+        <w:rPr>
+          <w:rFonts w:ascii="Times New Roman" w:cs="Times New Roman" w:eastAsia="Times New Roman" w:hAnsi="Times New Roman"/>
+          <w:b w:val="false"/>
+          <w:bCs w:val="false"/>
+          <w:i w:val="false"/>
+          <w:iCs w:val="false"/>
+          <w:sz w:val="28"/>
+          <w:szCs w:val="28"/>
+        </w:rPr>
+        <w:t xml:space="preserve">Управління особистими фінансами є актуальною задачею для кожної людини. У сучасному світі, де обсяги фінансових транзакцій постійно зростають, виникає потреба у зручних інструментах для обліку доходів та витрат, контролю бюджету та аналізу фінансового стану.</w:t>
+      </w:r>
+    </w:p>
+    <w:p>
+      <w:pPr>
+        <w:spacing w:after="120" w:line="360"/>
+        <w:ind w:firstLine="708"/>
+        <w:jc w:val="both"/>
+      </w:pPr>
+      <w:r>
+        <w:rPr>
+          <w:rFonts w:ascii="Times New Roman" w:cs="Times New Roman" w:eastAsia="Times New Roman" w:hAnsi="Times New Roman"/>
+          <w:b w:val="false"/>
+          <w:bCs w:val="false"/>
+          <w:i w:val="false"/>
+          <w:iCs w:val="false"/>
+          <w:sz w:val="28"/>
+          <w:szCs w:val="28"/>
+        </w:rPr>
+        <w:t xml:space="preserve">Метою даної курсової роботи є розробка веб-додатку для персонального фінансового менеджменту, який дозволяє користувачам відстежувати доходи та витрати, керувати рахунками, категоризувати транзакції, встановлювати місячні бюджети та візуалізувати фінансовий стан через графіки та звіти.</w:t>
+      </w:r>
+    </w:p>
+    <w:p>
+      <w:pPr>
+        <w:spacing w:after="120" w:line="360"/>
+        <w:ind w:firstLine="708"/>
+        <w:jc w:val="both"/>
+      </w:pPr>
+      <w:r>
+        <w:rPr>
+          <w:rFonts w:ascii="Times New Roman" w:cs="Times New Roman" w:eastAsia="Times New Roman" w:hAnsi="Times New Roman"/>
+          <w:b w:val="false"/>
+          <w:bCs w:val="false"/>
+          <w:i w:val="false"/>
+          <w:iCs w:val="false"/>
+          <w:sz w:val="28"/>
+          <w:szCs w:val="28"/>
+        </w:rPr>
+        <w:t xml:space="preserve">Додаток розробляється з використанням стеку технологій: Node.js 20 LTS, Express 4, шаблонізатор EJS, база даних SQLite (бібліотека better-sqlite3), CSS-фреймворк Bootstrap 5, бібліотека Chart.js для побудови графіків.</w:t>
+      </w:r>
+    </w:p>
+    <w:p>
+      <w:pPr>
+        <w:spacing w:after="120" w:line="360"/>
+        <w:ind w:firstLine="708"/>
+        <w:jc w:val="both"/>
+      </w:pPr>
+      <w:r>
+        <w:rPr>
+          <w:rFonts w:ascii="Times New Roman" w:cs="Times New Roman" w:eastAsia="Times New Roman" w:hAnsi="Times New Roman"/>
+          <w:b w:val="false"/>
+          <w:bCs w:val="false"/>
+          <w:i w:val="false"/>
+          <w:iCs w:val="false"/>
+          <w:sz w:val="28"/>
+          <w:szCs w:val="28"/>
+        </w:rPr>
+        <w:t xml:space="preserve">Проект розробляється командою з двох осіб з розподілом за функціональними модулями:</w:t>
+      </w:r>
+    </w:p>
+    <w:p>
+      <w:pPr>
+        <w:spacing w:after="120" w:line="360"/>
+        <w:ind w:firstLine="708"/>
+        <w:jc w:val="both"/>
+      </w:pPr>
+      <w:r>
+        <w:rPr>
+          <w:rFonts w:ascii="Times New Roman" w:cs="Times New Roman" w:eastAsia="Times New Roman" w:hAnsi="Times New Roman"/>
+          <w:b/>
+          <w:bCs/>
+          <w:i w:val="false"/>
+          <w:iCs w:val="false"/>
+          <w:sz w:val="28"/>
+          <w:szCs w:val="28"/>
+        </w:rPr>
+        <w:t xml:space="preserve">Степаненко Назар</w:t>
+      </w:r>
+      <w:r>
+        <w:rPr>
+          <w:rFonts w:ascii="Times New Roman" w:cs="Times New Roman" w:eastAsia="Times New Roman" w:hAnsi="Times New Roman"/>
+          <w:b w:val="false"/>
+          <w:bCs w:val="false"/>
+          <w:i w:val="false"/>
+          <w:iCs w:val="false"/>
+          <w:sz w:val="28"/>
+          <w:szCs w:val="28"/>
+        </w:rPr>
+        <w:t xml:space="preserve"> — авторизація, рахунки/гаманці, дашборд, графіки, інтеграція з API</w:t>
+      </w:r>
+    </w:p>
+    <w:p>
+      <w:pPr>
+        <w:spacing w:after="120" w:line="360"/>
+        <w:ind w:firstLine="708"/>
+        <w:jc w:val="both"/>
+      </w:pPr>
+      <w:r>
+        <w:rPr>
+          <w:rFonts w:ascii="Times New Roman" w:cs="Times New Roman" w:eastAsia="Times New Roman" w:hAnsi="Times New Roman"/>
+          <w:b/>
+          <w:bCs/>
+          <w:i w:val="false"/>
+          <w:iCs w:val="false"/>
+          <w:sz w:val="28"/>
+          <w:szCs w:val="28"/>
+        </w:rPr>
+        <w:t xml:space="preserve">Аніщенко Артем</w:t>
+      </w:r>
+      <w:r>
+        <w:rPr>
+          <w:rFonts w:ascii="Times New Roman" w:cs="Times New Roman" w:eastAsia="Times New Roman" w:hAnsi="Times New Roman"/>
+          <w:b w:val="false"/>
+          <w:bCs w:val="false"/>
+          <w:i w:val="false"/>
+          <w:iCs w:val="false"/>
+          <w:sz w:val="28"/>
+          <w:szCs w:val="28"/>
+        </w:rPr>
+        <w:t xml:space="preserve"> — категорії, транзакції, фільтрація, бюджети, експорт</w:t>
+      </w:r>
+    </w:p>
+    <w:p>
+      <w:pPr>
+        <w:spacing w:after="120" w:line="360"/>
+        <w:ind w:firstLine="708"/>
+        <w:jc w:val="both"/>
+      </w:pPr>
+      <w:r>
+        <w:rPr>
+          <w:rFonts w:ascii="Times New Roman" w:cs="Times New Roman" w:eastAsia="Times New Roman" w:hAnsi="Times New Roman"/>
+          <w:b w:val="false"/>
+          <w:bCs w:val="false"/>
+          <w:i w:val="false"/>
+          <w:iCs w:val="false"/>
+          <w:sz w:val="28"/>
+          <w:szCs w:val="28"/>
+        </w:rPr>
+        <w:t xml:space="preserve">У даному звіті описано роботу, виконану за пунктами 1–4 силабусу: створення UML-діаграм, проектування навігаційного меню, розміщення та стилізація елементів інтерфейсу, а також проектування і реалізація моделі даних.</w:t>
+      </w:r>
+    </w:p>
+    <w:p>
+      <w:r>
+        <w:br w:type="page"/>
+      </w:r>
+    </w:p>
+    <w:p>
+      <w:pPr>
+        <w:pStyle w:val="Heading1"/>
+        <w:spacing w:after="200" w:before="240" w:line="360"/>
+        <w:jc w:val="center"/>
+      </w:pPr>
+      <w:r>
+        <w:rPr>
+          <w:rFonts w:ascii="Times New Roman" w:cs="Times New Roman" w:eastAsia="Times New Roman" w:hAnsi="Times New Roman"/>
+          <w:b/>
+          <w:bCs/>
+          <w:sz w:val="32"/>
+          <w:szCs w:val="32"/>
+        </w:rPr>
         <w:t xml:space="preserve">РОЗДІЛ 1. СТВОРЕННЯ ДІАГРАМ КОМПОНЕНТІВ, ВЗАЄМОДІЇ ТА КЛАСІВ</w:t>
       </w:r>
     </w:p>
@@ -1308,7 +2828,7 @@
       <w:r>
         <w:drawing>
           <wp:inline distT="0" distB="0" distL="0" distR="0">
-            <wp:extent cx="5429250" cy="3619500"/>
+            <wp:extent cx="5429250" cy="4419600"/>
             <wp:effectExtent t="0" r="0" b="0" l="0"/>
             <wp:docPr id="1" name="" descr="" title=""/>
             <wp:cNvGraphicFramePr>
@@ -1333,7 +2853,7 @@
                   <pic:spPr bwMode="auto">
                     <a:xfrm>
                       <a:off x="0" y="0"/>
-                      <a:ext cx="5429250" cy="3619500"/>
+                      <a:ext cx="5429250" cy="4419600"/>
                     </a:xfrm>
                     <a:prstGeom prst="rect">
                       <a:avLst/>
@@ -1583,7 +3103,7 @@
       <w:r>
         <w:drawing>
           <wp:inline distT="0" distB="0" distL="0" distR="0">
-            <wp:extent cx="5429250" cy="3619500"/>
+            <wp:extent cx="5429250" cy="5238750"/>
             <wp:effectExtent t="0" r="0" b="0" l="0"/>
             <wp:docPr id="1" name="" descr="" title=""/>
             <wp:cNvGraphicFramePr>
@@ -1608,7 +3128,7 @@
                   <pic:spPr bwMode="auto">
                     <a:xfrm>
                       <a:off x="0" y="0"/>
-                      <a:ext cx="5429250" cy="3619500"/>
+                      <a:ext cx="5429250" cy="5238750"/>
                     </a:xfrm>
                     <a:prstGeom prst="rect">
                       <a:avLst/>
@@ -2298,7 +3818,7 @@
       <w:r>
         <w:drawing>
           <wp:inline distT="0" distB="0" distL="0" distR="0">
-            <wp:extent cx="5429250" cy="3619500"/>
+            <wp:extent cx="5429250" cy="5334000"/>
             <wp:effectExtent t="0" r="0" b="0" l="0"/>
             <wp:docPr id="1" name="" descr="" title=""/>
             <wp:cNvGraphicFramePr>
@@ -2323,7 +3843,7 @@
                   <pic:spPr bwMode="auto">
                     <a:xfrm>
                       <a:off x="0" y="0"/>
-                      <a:ext cx="5429250" cy="3619500"/>
+                      <a:ext cx="5429250" cy="5334000"/>
                     </a:xfrm>
                     <a:prstGeom prst="rect">
                       <a:avLst/>

</xml_diff>

<commit_message>
docs(CW/1-4): fix ЗМІСТ formatting with tab stops, add Технічне завдання
- Fix ЗМІСТ: use right-aligned tab stops with dot leaders (no more word stretching)
- Add TZ document with team split, stack, functionality, calendar plan
- Compact component diagram (LR subgraphs, proper aspect ratio)
</commit_message>
<xml_diff>
--- a/docs/CW_1-4_TB-43_Stepanenko.docx
+++ b/docs/CW_1-4_TB-43_Stepanenko.docx
@@ -1979,380 +1979,695 @@
     </w:p>
     <w:p>
       <w:pPr>
-        <w:spacing w:after="40" w:line="360"/>
-        <w:jc w:val="both"/>
-      </w:pPr>
-      <w:r>
-        <w:rPr>
-          <w:rFonts w:ascii="Times New Roman" w:cs="Times New Roman" w:eastAsia="Times New Roman" w:hAnsi="Times New Roman"/>
-          <w:b w:val="false"/>
-          <w:bCs w:val="false"/>
-          <w:i w:val="false"/>
-          <w:iCs w:val="false"/>
-          <w:sz w:val="28"/>
-          <w:szCs w:val="28"/>
-        </w:rPr>
-        <w:t xml:space="preserve">АНОТАЦІЯ .................................................................................................................. 3</w:t>
-      </w:r>
-    </w:p>
-    <w:p>
-      <w:pPr>
-        <w:spacing w:after="40" w:line="360"/>
-        <w:jc w:val="both"/>
-      </w:pPr>
-      <w:r>
-        <w:rPr>
-          <w:rFonts w:ascii="Times New Roman" w:cs="Times New Roman" w:eastAsia="Times New Roman" w:hAnsi="Times New Roman"/>
-          <w:b w:val="false"/>
-          <w:bCs w:val="false"/>
-          <w:i w:val="false"/>
-          <w:iCs w:val="false"/>
-          <w:sz w:val="28"/>
-          <w:szCs w:val="28"/>
-        </w:rPr>
-        <w:t xml:space="preserve">ВСТУП ...................................................................................................................... 5</w:t>
-      </w:r>
-    </w:p>
-    <w:p>
-      <w:pPr>
-        <w:spacing w:after="40" w:line="360"/>
-        <w:jc w:val="both"/>
-      </w:pPr>
-      <w:r>
-        <w:rPr>
-          <w:rFonts w:ascii="Times New Roman" w:cs="Times New Roman" w:eastAsia="Times New Roman" w:hAnsi="Times New Roman"/>
-          <w:b w:val="false"/>
-          <w:bCs w:val="false"/>
-          <w:i w:val="false"/>
-          <w:iCs w:val="false"/>
-          <w:sz w:val="28"/>
-          <w:szCs w:val="28"/>
-        </w:rPr>
-        <w:t xml:space="preserve">РОЗДІЛ 1. Створення діаграм компонентів, взаємодії та класів ........................... 6</w:t>
-      </w:r>
-    </w:p>
-    <w:p>
-      <w:pPr>
-        <w:spacing w:after="40" w:line="360"/>
-        <w:jc w:val="both"/>
-      </w:pPr>
-      <w:r>
-        <w:rPr>
-          <w:rFonts w:ascii="Times New Roman" w:cs="Times New Roman" w:eastAsia="Times New Roman" w:hAnsi="Times New Roman"/>
-          <w:b w:val="false"/>
-          <w:bCs w:val="false"/>
-          <w:i w:val="false"/>
-          <w:iCs w:val="false"/>
-          <w:sz w:val="28"/>
-          <w:szCs w:val="28"/>
-        </w:rPr>
-        <w:t xml:space="preserve">   1.1. Діаграма компонентів .................................................................................. 6</w:t>
-      </w:r>
-    </w:p>
-    <w:p>
-      <w:pPr>
-        <w:spacing w:after="40" w:line="360"/>
-        <w:jc w:val="both"/>
-      </w:pPr>
-      <w:r>
-        <w:rPr>
-          <w:rFonts w:ascii="Times New Roman" w:cs="Times New Roman" w:eastAsia="Times New Roman" w:hAnsi="Times New Roman"/>
-          <w:b w:val="false"/>
-          <w:bCs w:val="false"/>
-          <w:i w:val="false"/>
-          <w:iCs w:val="false"/>
-          <w:sz w:val="28"/>
-          <w:szCs w:val="28"/>
-        </w:rPr>
-        <w:t xml:space="preserve">   1.2. Діаграма взаємодії ...................................................................................... 8</w:t>
-      </w:r>
-    </w:p>
-    <w:p>
-      <w:pPr>
-        <w:spacing w:after="40" w:line="360"/>
-        <w:jc w:val="both"/>
-      </w:pPr>
-      <w:r>
-        <w:rPr>
-          <w:rFonts w:ascii="Times New Roman" w:cs="Times New Roman" w:eastAsia="Times New Roman" w:hAnsi="Times New Roman"/>
-          <w:b w:val="false"/>
-          <w:bCs w:val="false"/>
-          <w:i w:val="false"/>
-          <w:iCs w:val="false"/>
-          <w:sz w:val="28"/>
-          <w:szCs w:val="28"/>
-        </w:rPr>
-        <w:t xml:space="preserve">   1.3. Діаграма класів .......................................................................................... 9</w:t>
-      </w:r>
-    </w:p>
-    <w:p>
-      <w:pPr>
-        <w:spacing w:after="40" w:line="360"/>
-        <w:jc w:val="both"/>
-      </w:pPr>
-      <w:r>
-        <w:rPr>
-          <w:rFonts w:ascii="Times New Roman" w:cs="Times New Roman" w:eastAsia="Times New Roman" w:hAnsi="Times New Roman"/>
-          <w:b w:val="false"/>
-          <w:bCs w:val="false"/>
-          <w:i w:val="false"/>
-          <w:iCs w:val="false"/>
-          <w:sz w:val="28"/>
-          <w:szCs w:val="28"/>
-        </w:rPr>
-        <w:t xml:space="preserve">РОЗДІЛ 2. Проектування структури меню .............................................................. 11</w:t>
-      </w:r>
-    </w:p>
-    <w:p>
-      <w:pPr>
-        <w:spacing w:after="40" w:line="360"/>
-        <w:jc w:val="both"/>
-      </w:pPr>
-      <w:r>
-        <w:rPr>
-          <w:rFonts w:ascii="Times New Roman" w:cs="Times New Roman" w:eastAsia="Times New Roman" w:hAnsi="Times New Roman"/>
-          <w:b w:val="false"/>
-          <w:bCs w:val="false"/>
-          <w:i w:val="false"/>
-          <w:iCs w:val="false"/>
-          <w:sz w:val="28"/>
-          <w:szCs w:val="28"/>
-        </w:rPr>
-        <w:t xml:space="preserve">   2.1. Загальна структура навігації ...................................................................... 11</w:t>
-      </w:r>
-    </w:p>
-    <w:p>
-      <w:pPr>
-        <w:spacing w:after="40" w:line="360"/>
-        <w:jc w:val="both"/>
-      </w:pPr>
-      <w:r>
-        <w:rPr>
-          <w:rFonts w:ascii="Times New Roman" w:cs="Times New Roman" w:eastAsia="Times New Roman" w:hAnsi="Times New Roman"/>
-          <w:b w:val="false"/>
-          <w:bCs w:val="false"/>
-          <w:i w:val="false"/>
-          <w:iCs w:val="false"/>
-          <w:sz w:val="28"/>
-          <w:szCs w:val="28"/>
-        </w:rPr>
-        <w:t xml:space="preserve">   2.2. Обґрунтування вибору структури меню .................................................... 12</w:t>
-      </w:r>
-    </w:p>
-    <w:p>
-      <w:pPr>
-        <w:spacing w:after="40" w:line="360"/>
-        <w:jc w:val="both"/>
-      </w:pPr>
-      <w:r>
-        <w:rPr>
-          <w:rFonts w:ascii="Times New Roman" w:cs="Times New Roman" w:eastAsia="Times New Roman" w:hAnsi="Times New Roman"/>
-          <w:b w:val="false"/>
-          <w:bCs w:val="false"/>
-          <w:i w:val="false"/>
-          <w:iCs w:val="false"/>
-          <w:sz w:val="28"/>
-          <w:szCs w:val="28"/>
-        </w:rPr>
-        <w:t xml:space="preserve">РОЗДІЛ 3. Розміщення та стилізація елементів інтерфейсу ................................. 13</w:t>
-      </w:r>
-    </w:p>
-    <w:p>
-      <w:pPr>
-        <w:spacing w:after="40" w:line="360"/>
-        <w:jc w:val="both"/>
-      </w:pPr>
-      <w:r>
-        <w:rPr>
-          <w:rFonts w:ascii="Times New Roman" w:cs="Times New Roman" w:eastAsia="Times New Roman" w:hAnsi="Times New Roman"/>
-          <w:b w:val="false"/>
-          <w:bCs w:val="false"/>
-          <w:i w:val="false"/>
-          <w:iCs w:val="false"/>
-          <w:sz w:val="28"/>
-          <w:szCs w:val="28"/>
-        </w:rPr>
-        <w:t xml:space="preserve">   3.1. Технології стилізації ................................................................................... 13</w:t>
-      </w:r>
-    </w:p>
-    <w:p>
-      <w:pPr>
-        <w:spacing w:after="40" w:line="360"/>
-        <w:jc w:val="both"/>
-      </w:pPr>
-      <w:r>
-        <w:rPr>
-          <w:rFonts w:ascii="Times New Roman" w:cs="Times New Roman" w:eastAsia="Times New Roman" w:hAnsi="Times New Roman"/>
-          <w:b w:val="false"/>
-          <w:bCs w:val="false"/>
-          <w:i w:val="false"/>
-          <w:iCs w:val="false"/>
-          <w:sz w:val="28"/>
-          <w:szCs w:val="28"/>
-        </w:rPr>
-        <w:t xml:space="preserve">   3.2. Майстер-шаблон (layout) ........................................................................... 13</w:t>
-      </w:r>
-    </w:p>
-    <w:p>
-      <w:pPr>
-        <w:spacing w:after="40" w:line="360"/>
-        <w:jc w:val="both"/>
-      </w:pPr>
-      <w:r>
-        <w:rPr>
-          <w:rFonts w:ascii="Times New Roman" w:cs="Times New Roman" w:eastAsia="Times New Roman" w:hAnsi="Times New Roman"/>
-          <w:b w:val="false"/>
-          <w:bCs w:val="false"/>
-          <w:i w:val="false"/>
-          <w:iCs w:val="false"/>
-          <w:sz w:val="28"/>
-          <w:szCs w:val="28"/>
-        </w:rPr>
-        <w:t xml:space="preserve">   3.3. Компоненти інтерфейсу ............................................................................. 14</w:t>
-      </w:r>
-    </w:p>
-    <w:p>
-      <w:pPr>
-        <w:spacing w:after="40" w:line="360"/>
-        <w:jc w:val="both"/>
-      </w:pPr>
-      <w:r>
-        <w:rPr>
-          <w:rFonts w:ascii="Times New Roman" w:cs="Times New Roman" w:eastAsia="Times New Roman" w:hAnsi="Times New Roman"/>
-          <w:b w:val="false"/>
-          <w:bCs w:val="false"/>
-          <w:i w:val="false"/>
-          <w:iCs w:val="false"/>
-          <w:sz w:val="28"/>
-          <w:szCs w:val="28"/>
-        </w:rPr>
-        <w:t xml:space="preserve">   3.4. Адаптивний дизайн .................................................................................... 17</w:t>
-      </w:r>
-    </w:p>
-    <w:p>
-      <w:pPr>
-        <w:spacing w:after="40" w:line="360"/>
-        <w:jc w:val="both"/>
-      </w:pPr>
-      <w:r>
-        <w:rPr>
-          <w:rFonts w:ascii="Times New Roman" w:cs="Times New Roman" w:eastAsia="Times New Roman" w:hAnsi="Times New Roman"/>
-          <w:b w:val="false"/>
-          <w:bCs w:val="false"/>
-          <w:i w:val="false"/>
-          <w:iCs w:val="false"/>
-          <w:sz w:val="28"/>
-          <w:szCs w:val="28"/>
-        </w:rPr>
-        <w:t xml:space="preserve">РОЗДІЛ 4. Модель даних та її реалізація ............................................................... 19</w:t>
-      </w:r>
-    </w:p>
-    <w:p>
-      <w:pPr>
-        <w:spacing w:after="40" w:line="360"/>
-        <w:jc w:val="both"/>
-      </w:pPr>
-      <w:r>
-        <w:rPr>
-          <w:rFonts w:ascii="Times New Roman" w:cs="Times New Roman" w:eastAsia="Times New Roman" w:hAnsi="Times New Roman"/>
-          <w:b w:val="false"/>
-          <w:bCs w:val="false"/>
-          <w:i w:val="false"/>
-          <w:iCs w:val="false"/>
-          <w:sz w:val="28"/>
-          <w:szCs w:val="28"/>
-        </w:rPr>
-        <w:t xml:space="preserve">   4.1. Обрана СКБД ............................................................................................. 19</w:t>
-      </w:r>
-    </w:p>
-    <w:p>
-      <w:pPr>
-        <w:spacing w:after="40" w:line="360"/>
-        <w:jc w:val="both"/>
-      </w:pPr>
-      <w:r>
-        <w:rPr>
-          <w:rFonts w:ascii="Times New Roman" w:cs="Times New Roman" w:eastAsia="Times New Roman" w:hAnsi="Times New Roman"/>
-          <w:b w:val="false"/>
-          <w:bCs w:val="false"/>
-          <w:i w:val="false"/>
-          <w:iCs w:val="false"/>
-          <w:sz w:val="28"/>
-          <w:szCs w:val="28"/>
-        </w:rPr>
-        <w:t xml:space="preserve">   4.2. Схема бази даних ...................................................................................... 19</w:t>
-      </w:r>
-    </w:p>
-    <w:p>
-      <w:pPr>
-        <w:spacing w:after="40" w:line="360"/>
-        <w:jc w:val="both"/>
-      </w:pPr>
-      <w:r>
-        <w:rPr>
-          <w:rFonts w:ascii="Times New Roman" w:cs="Times New Roman" w:eastAsia="Times New Roman" w:hAnsi="Times New Roman"/>
-          <w:b w:val="false"/>
-          <w:bCs w:val="false"/>
-          <w:i w:val="false"/>
-          <w:iCs w:val="false"/>
-          <w:sz w:val="28"/>
-          <w:szCs w:val="28"/>
-        </w:rPr>
-        <w:t xml:space="preserve">   4.3. Зв'язки між таблицями .............................................................................. 21</w:t>
-      </w:r>
-    </w:p>
-    <w:p>
-      <w:pPr>
-        <w:spacing w:after="40" w:line="360"/>
-        <w:jc w:val="both"/>
-      </w:pPr>
-      <w:r>
-        <w:rPr>
-          <w:rFonts w:ascii="Times New Roman" w:cs="Times New Roman" w:eastAsia="Times New Roman" w:hAnsi="Times New Roman"/>
-          <w:b w:val="false"/>
-          <w:bCs w:val="false"/>
-          <w:i w:val="false"/>
-          <w:iCs w:val="false"/>
-          <w:sz w:val="28"/>
-          <w:szCs w:val="28"/>
-        </w:rPr>
-        <w:t xml:space="preserve">   4.4. Ініціалізація бази даних ............................................................................. 22</w:t>
-      </w:r>
-    </w:p>
-    <w:p>
-      <w:pPr>
-        <w:spacing w:after="40" w:line="360"/>
-        <w:jc w:val="both"/>
-      </w:pPr>
-      <w:r>
-        <w:rPr>
-          <w:rFonts w:ascii="Times New Roman" w:cs="Times New Roman" w:eastAsia="Times New Roman" w:hAnsi="Times New Roman"/>
-          <w:b w:val="false"/>
-          <w:bCs w:val="false"/>
-          <w:i w:val="false"/>
-          <w:iCs w:val="false"/>
-          <w:sz w:val="28"/>
-          <w:szCs w:val="28"/>
-        </w:rPr>
-        <w:t xml:space="preserve">ВИСНОВКИ .............................................................................................................. 23</w:t>
-      </w:r>
-    </w:p>
-    <w:p>
-      <w:pPr>
-        <w:spacing w:after="40" w:line="360"/>
-        <w:jc w:val="both"/>
-      </w:pPr>
-      <w:r>
-        <w:rPr>
-          <w:rFonts w:ascii="Times New Roman" w:cs="Times New Roman" w:eastAsia="Times New Roman" w:hAnsi="Times New Roman"/>
-          <w:b w:val="false"/>
-          <w:bCs w:val="false"/>
-          <w:i w:val="false"/>
-          <w:iCs w:val="false"/>
-          <w:sz w:val="28"/>
-          <w:szCs w:val="28"/>
-        </w:rPr>
-        <w:t xml:space="preserve">СПИСОК ВИКОРИСТАНИХ ДЖЕРЕЛ ...................................................................... 24</w:t>
+        <w:tabs>
+          <w:tab w:val="right" w:pos="8787" w:leader="dot"/>
+        </w:tabs>
+        <w:spacing w:after="60" w:line="360"/>
+        <w:jc w:val="left"/>
+      </w:pPr>
+      <w:r>
+        <w:rPr>
+          <w:rFonts w:ascii="Times New Roman" w:cs="Times New Roman" w:eastAsia="Times New Roman" w:hAnsi="Times New Roman"/>
+          <w:sz w:val="28"/>
+          <w:szCs w:val="28"/>
+        </w:rPr>
+        <w:t xml:space="preserve">АНОТАЦІЯ</w:t>
+      </w:r>
+      <w:r>
+        <w:rPr>
+          <w:rFonts w:ascii="Times New Roman" w:cs="Times New Roman" w:eastAsia="Times New Roman" w:hAnsi="Times New Roman"/>
+          <w:sz w:val="28"/>
+          <w:szCs w:val="28"/>
+        </w:rPr>
+        <w:t xml:space="preserve">	</w:t>
+      </w:r>
+      <w:r>
+        <w:rPr>
+          <w:rFonts w:ascii="Times New Roman" w:cs="Times New Roman" w:eastAsia="Times New Roman" w:hAnsi="Times New Roman"/>
+          <w:sz w:val="28"/>
+          <w:szCs w:val="28"/>
+        </w:rPr>
+        <w:t xml:space="preserve">3</w:t>
+      </w:r>
+    </w:p>
+    <w:p>
+      <w:pPr>
+        <w:tabs>
+          <w:tab w:val="right" w:pos="8787" w:leader="dot"/>
+        </w:tabs>
+        <w:spacing w:after="60" w:line="360"/>
+        <w:jc w:val="left"/>
+      </w:pPr>
+      <w:r>
+        <w:rPr>
+          <w:rFonts w:ascii="Times New Roman" w:cs="Times New Roman" w:eastAsia="Times New Roman" w:hAnsi="Times New Roman"/>
+          <w:sz w:val="28"/>
+          <w:szCs w:val="28"/>
+        </w:rPr>
+        <w:t xml:space="preserve">ВСТУП</w:t>
+      </w:r>
+      <w:r>
+        <w:rPr>
+          <w:rFonts w:ascii="Times New Roman" w:cs="Times New Roman" w:eastAsia="Times New Roman" w:hAnsi="Times New Roman"/>
+          <w:sz w:val="28"/>
+          <w:szCs w:val="28"/>
+        </w:rPr>
+        <w:t xml:space="preserve">	</w:t>
+      </w:r>
+      <w:r>
+        <w:rPr>
+          <w:rFonts w:ascii="Times New Roman" w:cs="Times New Roman" w:eastAsia="Times New Roman" w:hAnsi="Times New Roman"/>
+          <w:sz w:val="28"/>
+          <w:szCs w:val="28"/>
+        </w:rPr>
+        <w:t xml:space="preserve">5</w:t>
+      </w:r>
+    </w:p>
+    <w:p>
+      <w:pPr>
+        <w:tabs>
+          <w:tab w:val="right" w:pos="8787" w:leader="dot"/>
+        </w:tabs>
+        <w:spacing w:after="60" w:line="360"/>
+        <w:jc w:val="left"/>
+      </w:pPr>
+      <w:r>
+        <w:rPr>
+          <w:rFonts w:ascii="Times New Roman" w:cs="Times New Roman" w:eastAsia="Times New Roman" w:hAnsi="Times New Roman"/>
+          <w:sz w:val="28"/>
+          <w:szCs w:val="28"/>
+        </w:rPr>
+        <w:t xml:space="preserve">РОЗДІЛ 1. Створення діаграм компонентів, взаємодії та класів</w:t>
+      </w:r>
+      <w:r>
+        <w:rPr>
+          <w:rFonts w:ascii="Times New Roman" w:cs="Times New Roman" w:eastAsia="Times New Roman" w:hAnsi="Times New Roman"/>
+          <w:sz w:val="28"/>
+          <w:szCs w:val="28"/>
+        </w:rPr>
+        <w:t xml:space="preserve">	</w:t>
+      </w:r>
+      <w:r>
+        <w:rPr>
+          <w:rFonts w:ascii="Times New Roman" w:cs="Times New Roman" w:eastAsia="Times New Roman" w:hAnsi="Times New Roman"/>
+          <w:sz w:val="28"/>
+          <w:szCs w:val="28"/>
+        </w:rPr>
+        <w:t xml:space="preserve">6</w:t>
+      </w:r>
+    </w:p>
+    <w:p>
+      <w:pPr>
+        <w:tabs>
+          <w:tab w:val="right" w:pos="8787" w:leader="dot"/>
+        </w:tabs>
+        <w:spacing w:after="60" w:line="360"/>
+        <w:jc w:val="left"/>
+      </w:pPr>
+      <w:r>
+        <w:rPr>
+          <w:rFonts w:ascii="Times New Roman" w:cs="Times New Roman" w:eastAsia="Times New Roman" w:hAnsi="Times New Roman"/>
+          <w:sz w:val="28"/>
+          <w:szCs w:val="28"/>
+        </w:rPr>
+        <w:t xml:space="preserve">    1.1. Діаграма компонентів</w:t>
+      </w:r>
+      <w:r>
+        <w:rPr>
+          <w:rFonts w:ascii="Times New Roman" w:cs="Times New Roman" w:eastAsia="Times New Roman" w:hAnsi="Times New Roman"/>
+          <w:sz w:val="28"/>
+          <w:szCs w:val="28"/>
+        </w:rPr>
+        <w:t xml:space="preserve">	</w:t>
+      </w:r>
+      <w:r>
+        <w:rPr>
+          <w:rFonts w:ascii="Times New Roman" w:cs="Times New Roman" w:eastAsia="Times New Roman" w:hAnsi="Times New Roman"/>
+          <w:sz w:val="28"/>
+          <w:szCs w:val="28"/>
+        </w:rPr>
+        <w:t xml:space="preserve">6</w:t>
+      </w:r>
+    </w:p>
+    <w:p>
+      <w:pPr>
+        <w:tabs>
+          <w:tab w:val="right" w:pos="8787" w:leader="dot"/>
+        </w:tabs>
+        <w:spacing w:after="60" w:line="360"/>
+        <w:jc w:val="left"/>
+      </w:pPr>
+      <w:r>
+        <w:rPr>
+          <w:rFonts w:ascii="Times New Roman" w:cs="Times New Roman" w:eastAsia="Times New Roman" w:hAnsi="Times New Roman"/>
+          <w:sz w:val="28"/>
+          <w:szCs w:val="28"/>
+        </w:rPr>
+        <w:t xml:space="preserve">    1.2. Діаграма взаємодії</w:t>
+      </w:r>
+      <w:r>
+        <w:rPr>
+          <w:rFonts w:ascii="Times New Roman" w:cs="Times New Roman" w:eastAsia="Times New Roman" w:hAnsi="Times New Roman"/>
+          <w:sz w:val="28"/>
+          <w:szCs w:val="28"/>
+        </w:rPr>
+        <w:t xml:space="preserve">	</w:t>
+      </w:r>
+      <w:r>
+        <w:rPr>
+          <w:rFonts w:ascii="Times New Roman" w:cs="Times New Roman" w:eastAsia="Times New Roman" w:hAnsi="Times New Roman"/>
+          <w:sz w:val="28"/>
+          <w:szCs w:val="28"/>
+        </w:rPr>
+        <w:t xml:space="preserve">8</w:t>
+      </w:r>
+    </w:p>
+    <w:p>
+      <w:pPr>
+        <w:tabs>
+          <w:tab w:val="right" w:pos="8787" w:leader="dot"/>
+        </w:tabs>
+        <w:spacing w:after="60" w:line="360"/>
+        <w:jc w:val="left"/>
+      </w:pPr>
+      <w:r>
+        <w:rPr>
+          <w:rFonts w:ascii="Times New Roman" w:cs="Times New Roman" w:eastAsia="Times New Roman" w:hAnsi="Times New Roman"/>
+          <w:sz w:val="28"/>
+          <w:szCs w:val="28"/>
+        </w:rPr>
+        <w:t xml:space="preserve">    1.3. Діаграма класів</w:t>
+      </w:r>
+      <w:r>
+        <w:rPr>
+          <w:rFonts w:ascii="Times New Roman" w:cs="Times New Roman" w:eastAsia="Times New Roman" w:hAnsi="Times New Roman"/>
+          <w:sz w:val="28"/>
+          <w:szCs w:val="28"/>
+        </w:rPr>
+        <w:t xml:space="preserve">	</w:t>
+      </w:r>
+      <w:r>
+        <w:rPr>
+          <w:rFonts w:ascii="Times New Roman" w:cs="Times New Roman" w:eastAsia="Times New Roman" w:hAnsi="Times New Roman"/>
+          <w:sz w:val="28"/>
+          <w:szCs w:val="28"/>
+        </w:rPr>
+        <w:t xml:space="preserve">9</w:t>
+      </w:r>
+    </w:p>
+    <w:p>
+      <w:pPr>
+        <w:tabs>
+          <w:tab w:val="right" w:pos="8787" w:leader="dot"/>
+        </w:tabs>
+        <w:spacing w:after="60" w:line="360"/>
+        <w:jc w:val="left"/>
+      </w:pPr>
+      <w:r>
+        <w:rPr>
+          <w:rFonts w:ascii="Times New Roman" w:cs="Times New Roman" w:eastAsia="Times New Roman" w:hAnsi="Times New Roman"/>
+          <w:sz w:val="28"/>
+          <w:szCs w:val="28"/>
+        </w:rPr>
+        <w:t xml:space="preserve">РОЗДІЛ 2. Проектування структури меню</w:t>
+      </w:r>
+      <w:r>
+        <w:rPr>
+          <w:rFonts w:ascii="Times New Roman" w:cs="Times New Roman" w:eastAsia="Times New Roman" w:hAnsi="Times New Roman"/>
+          <w:sz w:val="28"/>
+          <w:szCs w:val="28"/>
+        </w:rPr>
+        <w:t xml:space="preserve">	</w:t>
+      </w:r>
+      <w:r>
+        <w:rPr>
+          <w:rFonts w:ascii="Times New Roman" w:cs="Times New Roman" w:eastAsia="Times New Roman" w:hAnsi="Times New Roman"/>
+          <w:sz w:val="28"/>
+          <w:szCs w:val="28"/>
+        </w:rPr>
+        <w:t xml:space="preserve">11</w:t>
+      </w:r>
+    </w:p>
+    <w:p>
+      <w:pPr>
+        <w:tabs>
+          <w:tab w:val="right" w:pos="8787" w:leader="dot"/>
+        </w:tabs>
+        <w:spacing w:after="60" w:line="360"/>
+        <w:jc w:val="left"/>
+      </w:pPr>
+      <w:r>
+        <w:rPr>
+          <w:rFonts w:ascii="Times New Roman" w:cs="Times New Roman" w:eastAsia="Times New Roman" w:hAnsi="Times New Roman"/>
+          <w:sz w:val="28"/>
+          <w:szCs w:val="28"/>
+        </w:rPr>
+        <w:t xml:space="preserve">    2.1. Загальна структура навігації</w:t>
+      </w:r>
+      <w:r>
+        <w:rPr>
+          <w:rFonts w:ascii="Times New Roman" w:cs="Times New Roman" w:eastAsia="Times New Roman" w:hAnsi="Times New Roman"/>
+          <w:sz w:val="28"/>
+          <w:szCs w:val="28"/>
+        </w:rPr>
+        <w:t xml:space="preserve">	</w:t>
+      </w:r>
+      <w:r>
+        <w:rPr>
+          <w:rFonts w:ascii="Times New Roman" w:cs="Times New Roman" w:eastAsia="Times New Roman" w:hAnsi="Times New Roman"/>
+          <w:sz w:val="28"/>
+          <w:szCs w:val="28"/>
+        </w:rPr>
+        <w:t xml:space="preserve">11</w:t>
+      </w:r>
+    </w:p>
+    <w:p>
+      <w:pPr>
+        <w:tabs>
+          <w:tab w:val="right" w:pos="8787" w:leader="dot"/>
+        </w:tabs>
+        <w:spacing w:after="60" w:line="360"/>
+        <w:jc w:val="left"/>
+      </w:pPr>
+      <w:r>
+        <w:rPr>
+          <w:rFonts w:ascii="Times New Roman" w:cs="Times New Roman" w:eastAsia="Times New Roman" w:hAnsi="Times New Roman"/>
+          <w:sz w:val="28"/>
+          <w:szCs w:val="28"/>
+        </w:rPr>
+        <w:t xml:space="preserve">    2.2. Обґрунтування вибору структури меню</w:t>
+      </w:r>
+      <w:r>
+        <w:rPr>
+          <w:rFonts w:ascii="Times New Roman" w:cs="Times New Roman" w:eastAsia="Times New Roman" w:hAnsi="Times New Roman"/>
+          <w:sz w:val="28"/>
+          <w:szCs w:val="28"/>
+        </w:rPr>
+        <w:t xml:space="preserve">	</w:t>
+      </w:r>
+      <w:r>
+        <w:rPr>
+          <w:rFonts w:ascii="Times New Roman" w:cs="Times New Roman" w:eastAsia="Times New Roman" w:hAnsi="Times New Roman"/>
+          <w:sz w:val="28"/>
+          <w:szCs w:val="28"/>
+        </w:rPr>
+        <w:t xml:space="preserve">12</w:t>
+      </w:r>
+    </w:p>
+    <w:p>
+      <w:pPr>
+        <w:tabs>
+          <w:tab w:val="right" w:pos="8787" w:leader="dot"/>
+        </w:tabs>
+        <w:spacing w:after="60" w:line="360"/>
+        <w:jc w:val="left"/>
+      </w:pPr>
+      <w:r>
+        <w:rPr>
+          <w:rFonts w:ascii="Times New Roman" w:cs="Times New Roman" w:eastAsia="Times New Roman" w:hAnsi="Times New Roman"/>
+          <w:sz w:val="28"/>
+          <w:szCs w:val="28"/>
+        </w:rPr>
+        <w:t xml:space="preserve">РОЗДІЛ 3. Розміщення та стилізація елементів інтерфейсу</w:t>
+      </w:r>
+      <w:r>
+        <w:rPr>
+          <w:rFonts w:ascii="Times New Roman" w:cs="Times New Roman" w:eastAsia="Times New Roman" w:hAnsi="Times New Roman"/>
+          <w:sz w:val="28"/>
+          <w:szCs w:val="28"/>
+        </w:rPr>
+        <w:t xml:space="preserve">	</w:t>
+      </w:r>
+      <w:r>
+        <w:rPr>
+          <w:rFonts w:ascii="Times New Roman" w:cs="Times New Roman" w:eastAsia="Times New Roman" w:hAnsi="Times New Roman"/>
+          <w:sz w:val="28"/>
+          <w:szCs w:val="28"/>
+        </w:rPr>
+        <w:t xml:space="preserve">13</w:t>
+      </w:r>
+    </w:p>
+    <w:p>
+      <w:pPr>
+        <w:tabs>
+          <w:tab w:val="right" w:pos="8787" w:leader="dot"/>
+        </w:tabs>
+        <w:spacing w:after="60" w:line="360"/>
+        <w:jc w:val="left"/>
+      </w:pPr>
+      <w:r>
+        <w:rPr>
+          <w:rFonts w:ascii="Times New Roman" w:cs="Times New Roman" w:eastAsia="Times New Roman" w:hAnsi="Times New Roman"/>
+          <w:sz w:val="28"/>
+          <w:szCs w:val="28"/>
+        </w:rPr>
+        <w:t xml:space="preserve">    3.1. Технології стилізації</w:t>
+      </w:r>
+      <w:r>
+        <w:rPr>
+          <w:rFonts w:ascii="Times New Roman" w:cs="Times New Roman" w:eastAsia="Times New Roman" w:hAnsi="Times New Roman"/>
+          <w:sz w:val="28"/>
+          <w:szCs w:val="28"/>
+        </w:rPr>
+        <w:t xml:space="preserve">	</w:t>
+      </w:r>
+      <w:r>
+        <w:rPr>
+          <w:rFonts w:ascii="Times New Roman" w:cs="Times New Roman" w:eastAsia="Times New Roman" w:hAnsi="Times New Roman"/>
+          <w:sz w:val="28"/>
+          <w:szCs w:val="28"/>
+        </w:rPr>
+        <w:t xml:space="preserve">13</w:t>
+      </w:r>
+    </w:p>
+    <w:p>
+      <w:pPr>
+        <w:tabs>
+          <w:tab w:val="right" w:pos="8787" w:leader="dot"/>
+        </w:tabs>
+        <w:spacing w:after="60" w:line="360"/>
+        <w:jc w:val="left"/>
+      </w:pPr>
+      <w:r>
+        <w:rPr>
+          <w:rFonts w:ascii="Times New Roman" w:cs="Times New Roman" w:eastAsia="Times New Roman" w:hAnsi="Times New Roman"/>
+          <w:sz w:val="28"/>
+          <w:szCs w:val="28"/>
+        </w:rPr>
+        <w:t xml:space="preserve">    3.2. Майстер-шаблон (layout)</w:t>
+      </w:r>
+      <w:r>
+        <w:rPr>
+          <w:rFonts w:ascii="Times New Roman" w:cs="Times New Roman" w:eastAsia="Times New Roman" w:hAnsi="Times New Roman"/>
+          <w:sz w:val="28"/>
+          <w:szCs w:val="28"/>
+        </w:rPr>
+        <w:t xml:space="preserve">	</w:t>
+      </w:r>
+      <w:r>
+        <w:rPr>
+          <w:rFonts w:ascii="Times New Roman" w:cs="Times New Roman" w:eastAsia="Times New Roman" w:hAnsi="Times New Roman"/>
+          <w:sz w:val="28"/>
+          <w:szCs w:val="28"/>
+        </w:rPr>
+        <w:t xml:space="preserve">13</w:t>
+      </w:r>
+    </w:p>
+    <w:p>
+      <w:pPr>
+        <w:tabs>
+          <w:tab w:val="right" w:pos="8787" w:leader="dot"/>
+        </w:tabs>
+        <w:spacing w:after="60" w:line="360"/>
+        <w:jc w:val="left"/>
+      </w:pPr>
+      <w:r>
+        <w:rPr>
+          <w:rFonts w:ascii="Times New Roman" w:cs="Times New Roman" w:eastAsia="Times New Roman" w:hAnsi="Times New Roman"/>
+          <w:sz w:val="28"/>
+          <w:szCs w:val="28"/>
+        </w:rPr>
+        <w:t xml:space="preserve">    3.3. Компоненти інтерфейсу</w:t>
+      </w:r>
+      <w:r>
+        <w:rPr>
+          <w:rFonts w:ascii="Times New Roman" w:cs="Times New Roman" w:eastAsia="Times New Roman" w:hAnsi="Times New Roman"/>
+          <w:sz w:val="28"/>
+          <w:szCs w:val="28"/>
+        </w:rPr>
+        <w:t xml:space="preserve">	</w:t>
+      </w:r>
+      <w:r>
+        <w:rPr>
+          <w:rFonts w:ascii="Times New Roman" w:cs="Times New Roman" w:eastAsia="Times New Roman" w:hAnsi="Times New Roman"/>
+          <w:sz w:val="28"/>
+          <w:szCs w:val="28"/>
+        </w:rPr>
+        <w:t xml:space="preserve">14</w:t>
+      </w:r>
+    </w:p>
+    <w:p>
+      <w:pPr>
+        <w:tabs>
+          <w:tab w:val="right" w:pos="8787" w:leader="dot"/>
+        </w:tabs>
+        <w:spacing w:after="60" w:line="360"/>
+        <w:jc w:val="left"/>
+      </w:pPr>
+      <w:r>
+        <w:rPr>
+          <w:rFonts w:ascii="Times New Roman" w:cs="Times New Roman" w:eastAsia="Times New Roman" w:hAnsi="Times New Roman"/>
+          <w:sz w:val="28"/>
+          <w:szCs w:val="28"/>
+        </w:rPr>
+        <w:t xml:space="preserve">    3.4. Адаптивний дизайн</w:t>
+      </w:r>
+      <w:r>
+        <w:rPr>
+          <w:rFonts w:ascii="Times New Roman" w:cs="Times New Roman" w:eastAsia="Times New Roman" w:hAnsi="Times New Roman"/>
+          <w:sz w:val="28"/>
+          <w:szCs w:val="28"/>
+        </w:rPr>
+        <w:t xml:space="preserve">	</w:t>
+      </w:r>
+      <w:r>
+        <w:rPr>
+          <w:rFonts w:ascii="Times New Roman" w:cs="Times New Roman" w:eastAsia="Times New Roman" w:hAnsi="Times New Roman"/>
+          <w:sz w:val="28"/>
+          <w:szCs w:val="28"/>
+        </w:rPr>
+        <w:t xml:space="preserve">17</w:t>
+      </w:r>
+    </w:p>
+    <w:p>
+      <w:pPr>
+        <w:tabs>
+          <w:tab w:val="right" w:pos="8787" w:leader="dot"/>
+        </w:tabs>
+        <w:spacing w:after="60" w:line="360"/>
+        <w:jc w:val="left"/>
+      </w:pPr>
+      <w:r>
+        <w:rPr>
+          <w:rFonts w:ascii="Times New Roman" w:cs="Times New Roman" w:eastAsia="Times New Roman" w:hAnsi="Times New Roman"/>
+          <w:sz w:val="28"/>
+          <w:szCs w:val="28"/>
+        </w:rPr>
+        <w:t xml:space="preserve">РОЗДІЛ 4. Модель даних та її реалізація</w:t>
+      </w:r>
+      <w:r>
+        <w:rPr>
+          <w:rFonts w:ascii="Times New Roman" w:cs="Times New Roman" w:eastAsia="Times New Roman" w:hAnsi="Times New Roman"/>
+          <w:sz w:val="28"/>
+          <w:szCs w:val="28"/>
+        </w:rPr>
+        <w:t xml:space="preserve">	</w:t>
+      </w:r>
+      <w:r>
+        <w:rPr>
+          <w:rFonts w:ascii="Times New Roman" w:cs="Times New Roman" w:eastAsia="Times New Roman" w:hAnsi="Times New Roman"/>
+          <w:sz w:val="28"/>
+          <w:szCs w:val="28"/>
+        </w:rPr>
+        <w:t xml:space="preserve">19</w:t>
+      </w:r>
+    </w:p>
+    <w:p>
+      <w:pPr>
+        <w:tabs>
+          <w:tab w:val="right" w:pos="8787" w:leader="dot"/>
+        </w:tabs>
+        <w:spacing w:after="60" w:line="360"/>
+        <w:jc w:val="left"/>
+      </w:pPr>
+      <w:r>
+        <w:rPr>
+          <w:rFonts w:ascii="Times New Roman" w:cs="Times New Roman" w:eastAsia="Times New Roman" w:hAnsi="Times New Roman"/>
+          <w:sz w:val="28"/>
+          <w:szCs w:val="28"/>
+        </w:rPr>
+        <w:t xml:space="preserve">    4.1. Обрана СКБД</w:t>
+      </w:r>
+      <w:r>
+        <w:rPr>
+          <w:rFonts w:ascii="Times New Roman" w:cs="Times New Roman" w:eastAsia="Times New Roman" w:hAnsi="Times New Roman"/>
+          <w:sz w:val="28"/>
+          <w:szCs w:val="28"/>
+        </w:rPr>
+        <w:t xml:space="preserve">	</w:t>
+      </w:r>
+      <w:r>
+        <w:rPr>
+          <w:rFonts w:ascii="Times New Roman" w:cs="Times New Roman" w:eastAsia="Times New Roman" w:hAnsi="Times New Roman"/>
+          <w:sz w:val="28"/>
+          <w:szCs w:val="28"/>
+        </w:rPr>
+        <w:t xml:space="preserve">19</w:t>
+      </w:r>
+    </w:p>
+    <w:p>
+      <w:pPr>
+        <w:tabs>
+          <w:tab w:val="right" w:pos="8787" w:leader="dot"/>
+        </w:tabs>
+        <w:spacing w:after="60" w:line="360"/>
+        <w:jc w:val="left"/>
+      </w:pPr>
+      <w:r>
+        <w:rPr>
+          <w:rFonts w:ascii="Times New Roman" w:cs="Times New Roman" w:eastAsia="Times New Roman" w:hAnsi="Times New Roman"/>
+          <w:sz w:val="28"/>
+          <w:szCs w:val="28"/>
+        </w:rPr>
+        <w:t xml:space="preserve">    4.2. Схема бази даних</w:t>
+      </w:r>
+      <w:r>
+        <w:rPr>
+          <w:rFonts w:ascii="Times New Roman" w:cs="Times New Roman" w:eastAsia="Times New Roman" w:hAnsi="Times New Roman"/>
+          <w:sz w:val="28"/>
+          <w:szCs w:val="28"/>
+        </w:rPr>
+        <w:t xml:space="preserve">	</w:t>
+      </w:r>
+      <w:r>
+        <w:rPr>
+          <w:rFonts w:ascii="Times New Roman" w:cs="Times New Roman" w:eastAsia="Times New Roman" w:hAnsi="Times New Roman"/>
+          <w:sz w:val="28"/>
+          <w:szCs w:val="28"/>
+        </w:rPr>
+        <w:t xml:space="preserve">19</w:t>
+      </w:r>
+    </w:p>
+    <w:p>
+      <w:pPr>
+        <w:tabs>
+          <w:tab w:val="right" w:pos="8787" w:leader="dot"/>
+        </w:tabs>
+        <w:spacing w:after="60" w:line="360"/>
+        <w:jc w:val="left"/>
+      </w:pPr>
+      <w:r>
+        <w:rPr>
+          <w:rFonts w:ascii="Times New Roman" w:cs="Times New Roman" w:eastAsia="Times New Roman" w:hAnsi="Times New Roman"/>
+          <w:sz w:val="28"/>
+          <w:szCs w:val="28"/>
+        </w:rPr>
+        <w:t xml:space="preserve">    4.3. Зв'язки між таблицями</w:t>
+      </w:r>
+      <w:r>
+        <w:rPr>
+          <w:rFonts w:ascii="Times New Roman" w:cs="Times New Roman" w:eastAsia="Times New Roman" w:hAnsi="Times New Roman"/>
+          <w:sz w:val="28"/>
+          <w:szCs w:val="28"/>
+        </w:rPr>
+        <w:t xml:space="preserve">	</w:t>
+      </w:r>
+      <w:r>
+        <w:rPr>
+          <w:rFonts w:ascii="Times New Roman" w:cs="Times New Roman" w:eastAsia="Times New Roman" w:hAnsi="Times New Roman"/>
+          <w:sz w:val="28"/>
+          <w:szCs w:val="28"/>
+        </w:rPr>
+        <w:t xml:space="preserve">21</w:t>
+      </w:r>
+    </w:p>
+    <w:p>
+      <w:pPr>
+        <w:tabs>
+          <w:tab w:val="right" w:pos="8787" w:leader="dot"/>
+        </w:tabs>
+        <w:spacing w:after="60" w:line="360"/>
+        <w:jc w:val="left"/>
+      </w:pPr>
+      <w:r>
+        <w:rPr>
+          <w:rFonts w:ascii="Times New Roman" w:cs="Times New Roman" w:eastAsia="Times New Roman" w:hAnsi="Times New Roman"/>
+          <w:sz w:val="28"/>
+          <w:szCs w:val="28"/>
+        </w:rPr>
+        <w:t xml:space="preserve">    4.4. Ініціалізація бази даних</w:t>
+      </w:r>
+      <w:r>
+        <w:rPr>
+          <w:rFonts w:ascii="Times New Roman" w:cs="Times New Roman" w:eastAsia="Times New Roman" w:hAnsi="Times New Roman"/>
+          <w:sz w:val="28"/>
+          <w:szCs w:val="28"/>
+        </w:rPr>
+        <w:t xml:space="preserve">	</w:t>
+      </w:r>
+      <w:r>
+        <w:rPr>
+          <w:rFonts w:ascii="Times New Roman" w:cs="Times New Roman" w:eastAsia="Times New Roman" w:hAnsi="Times New Roman"/>
+          <w:sz w:val="28"/>
+          <w:szCs w:val="28"/>
+        </w:rPr>
+        <w:t xml:space="preserve">22</w:t>
+      </w:r>
+    </w:p>
+    <w:p>
+      <w:pPr>
+        <w:tabs>
+          <w:tab w:val="right" w:pos="8787" w:leader="dot"/>
+        </w:tabs>
+        <w:spacing w:after="60" w:line="360"/>
+        <w:jc w:val="left"/>
+      </w:pPr>
+      <w:r>
+        <w:rPr>
+          <w:rFonts w:ascii="Times New Roman" w:cs="Times New Roman" w:eastAsia="Times New Roman" w:hAnsi="Times New Roman"/>
+          <w:sz w:val="28"/>
+          <w:szCs w:val="28"/>
+        </w:rPr>
+        <w:t xml:space="preserve">ВИСНОВКИ</w:t>
+      </w:r>
+      <w:r>
+        <w:rPr>
+          <w:rFonts w:ascii="Times New Roman" w:cs="Times New Roman" w:eastAsia="Times New Roman" w:hAnsi="Times New Roman"/>
+          <w:sz w:val="28"/>
+          <w:szCs w:val="28"/>
+        </w:rPr>
+        <w:t xml:space="preserve">	</w:t>
+      </w:r>
+      <w:r>
+        <w:rPr>
+          <w:rFonts w:ascii="Times New Roman" w:cs="Times New Roman" w:eastAsia="Times New Roman" w:hAnsi="Times New Roman"/>
+          <w:sz w:val="28"/>
+          <w:szCs w:val="28"/>
+        </w:rPr>
+        <w:t xml:space="preserve">23</w:t>
+      </w:r>
+    </w:p>
+    <w:p>
+      <w:pPr>
+        <w:tabs>
+          <w:tab w:val="right" w:pos="8787" w:leader="dot"/>
+        </w:tabs>
+        <w:spacing w:after="60" w:line="360"/>
+        <w:jc w:val="left"/>
+      </w:pPr>
+      <w:r>
+        <w:rPr>
+          <w:rFonts w:ascii="Times New Roman" w:cs="Times New Roman" w:eastAsia="Times New Roman" w:hAnsi="Times New Roman"/>
+          <w:sz w:val="28"/>
+          <w:szCs w:val="28"/>
+        </w:rPr>
+        <w:t xml:space="preserve">СПИСОК ВИКОРИСТАНИХ ДЖЕРЕЛ</w:t>
+      </w:r>
+      <w:r>
+        <w:rPr>
+          <w:rFonts w:ascii="Times New Roman" w:cs="Times New Roman" w:eastAsia="Times New Roman" w:hAnsi="Times New Roman"/>
+          <w:sz w:val="28"/>
+          <w:szCs w:val="28"/>
+        </w:rPr>
+        <w:t xml:space="preserve">	</w:t>
+      </w:r>
+      <w:r>
+        <w:rPr>
+          <w:rFonts w:ascii="Times New Roman" w:cs="Times New Roman" w:eastAsia="Times New Roman" w:hAnsi="Times New Roman"/>
+          <w:sz w:val="28"/>
+          <w:szCs w:val="28"/>
+        </w:rPr>
+        <w:t xml:space="preserve">24</w:t>
       </w:r>
     </w:p>
     <w:p>

</xml_diff>